<commit_message>
v0.1.12: update document templates (7 files)
</commit_message>
<xml_diff>
--- a/templates/Заявление_14.3.docx
+++ b/templates/Заявление_14.3.docx
@@ -570,6 +570,412 @@
       </w:r>
       <w:r>
         <w:rPr>
+          <w:b/>
+          <w:bCs/>
+          <w:i/>
+          <w:lang w:val="en-US"/>
+        </w:rPr>
+        <w:t>Placeholder</w:t>
+      </w:r>
+      <w:r>
+        <w:rPr>
+          <w:b/>
+          <w:bCs/>
+          <w:i/>
+        </w:rPr>
+        <w:t>_4</w:t>
+      </w:r>
+      <w:r>
+        <w:rPr>
+          <w:i/>
+        </w:rPr>
+        <w:t xml:space="preserve"> </w:t>
+      </w:r>
+      <w:r>
+        <w:t>районе(ах) Гомельской области</w:t>
+      </w:r>
+      <w:r>
+        <w:t>,</w:t>
+      </w:r>
+      <w:r>
+        <w:t xml:space="preserve"> </w:t>
+      </w:r>
+      <w:r>
+        <w:t>на следующем(их) о</w:t>
+      </w:r>
+      <w:r>
+        <w:t xml:space="preserve">бъекте(ах) </w:t>
+      </w:r>
+      <w:r>
+        <w:rPr>
+          <w:b/>
+          <w:bCs/>
+          <w:i/>
+          <w:lang w:val="en-US"/>
+        </w:rPr>
+        <w:t>Placeholder</w:t>
+      </w:r>
+      <w:r>
+        <w:rPr>
+          <w:b/>
+          <w:bCs/>
+          <w:i/>
+        </w:rPr>
+        <w:t>_</w:t>
+      </w:r>
+      <w:r>
+        <w:rPr>
+          <w:b/>
+          <w:bCs/>
+          <w:i/>
+        </w:rPr>
+        <w:t>5</w:t>
+      </w:r>
+      <w:r>
+        <w:rPr>
+          <w:vertAlign w:val="superscript"/>
+        </w:rPr>
+        <w:t xml:space="preserve"> </w:t>
+      </w:r>
+      <w:r>
+        <w:t>с целью</w:t>
+      </w:r>
+      <w:r>
+        <w:t>:</w:t>
+      </w:r>
+      <w:r>
+        <w:t xml:space="preserve"> </w:t>
+      </w:r>
+      <w:r>
+        <w:rPr>
+          <w:b/>
+          <w:bCs/>
+          <w:i/>
+          <w:lang w:val="en-US"/>
+        </w:rPr>
+        <w:t>Placeholder</w:t>
+      </w:r>
+      <w:r>
+        <w:rPr>
+          <w:b/>
+          <w:bCs/>
+          <w:i/>
+        </w:rPr>
+        <w:t>_6</w:t>
+      </w:r>
+      <w:r>
+        <w:rPr>
+          <w:b/>
+          <w:bCs/>
+          <w:i/>
+        </w:rPr>
+        <w:t xml:space="preserve"> </w:t>
+      </w:r>
+      <w:r>
+        <w:t xml:space="preserve">на срок </w:t>
+      </w:r>
+      <w:r>
+        <w:rPr>
+          <w:i/>
+        </w:rPr>
+        <w:t>с</w:t>
+      </w:r>
+      <w:r>
+        <w:rPr>
+          <w:i/>
+        </w:rPr>
+        <w:t xml:space="preserve"> </w:t>
+      </w:r>
+      <w:r>
+        <w:rPr>
+          <w:b/>
+          <w:bCs/>
+          <w:i/>
+          <w:lang w:val="en-US"/>
+        </w:rPr>
+        <w:t>Placeholder</w:t>
+      </w:r>
+      <w:r>
+        <w:rPr>
+          <w:b/>
+          <w:bCs/>
+          <w:i/>
+        </w:rPr>
+        <w:t>_7</w:t>
+      </w:r>
+      <w:r>
+        <w:rPr>
+          <w:i/>
+        </w:rPr>
+        <w:t xml:space="preserve"> по </w:t>
+      </w:r>
+      <w:r>
+        <w:rPr>
+          <w:b/>
+          <w:bCs/>
+          <w:i/>
+          <w:lang w:val="en-US"/>
+        </w:rPr>
+        <w:t>Placeholder</w:t>
+      </w:r>
+      <w:r>
+        <w:rPr>
+          <w:b/>
+          <w:bCs/>
+          <w:i/>
+        </w:rPr>
+        <w:t>_8</w:t>
+      </w:r>
+      <w:r>
+        <w:rPr>
+          <w:i/>
+        </w:rPr>
+        <w:t xml:space="preserve"> </w:t>
+      </w:r>
+      <w:r>
+        <w:t>для</w:t>
+      </w:r>
+      <w:r>
+        <w:t xml:space="preserve"> </w:t>
+      </w:r>
+      <w:r>
+        <w:t>меня лично и следующего(их) со мной:</w:t>
+      </w:r>
+    </w:p>
+    <w:p>
+      <w:pPr>
+        <w:pStyle w:val="newncpi"/>
+        <w:numPr>
+          <w:ilvl w:val="0"/>
+          <w:numId w:val="4"/>
+        </w:numPr>
+        <w:rPr>
+          <w:sz w:val="22"/>
+          <w:szCs w:val="22"/>
+        </w:rPr>
+      </w:pPr>
+      <w:r>
+        <w:rPr>
+          <w:i/>
+          <w:lang w:val="en-US"/>
+        </w:rPr>
+        <w:t>Placeholder</w:t>
+      </w:r>
+      <w:r>
+        <w:rPr>
+          <w:i/>
+        </w:rPr>
+        <w:t xml:space="preserve">_10.1 </w:t>
+      </w:r>
+      <w:r>
+        <w:rPr>
+          <w:i/>
+          <w:lang w:val="en-US"/>
+        </w:rPr>
+        <w:t>Placeholder</w:t>
+      </w:r>
+      <w:r>
+        <w:rPr>
+          <w:i/>
+        </w:rPr>
+        <w:t xml:space="preserve">_10.2 </w:t>
+      </w:r>
+      <w:r>
+        <w:rPr>
+          <w:i/>
+          <w:lang w:val="en-US"/>
+        </w:rPr>
+        <w:t>Placeholder</w:t>
+      </w:r>
+      <w:r>
+        <w:rPr>
+          <w:i/>
+        </w:rPr>
+        <w:t>_</w:t>
+      </w:r>
+      <w:r>
+        <w:rPr>
+          <w:i/>
+          <w:lang w:val="en-US"/>
+        </w:rPr>
+        <w:t>10</w:t>
+      </w:r>
+      <w:r>
+        <w:rPr>
+          <w:i/>
+        </w:rPr>
+        <w:t xml:space="preserve">.3, </w:t>
+      </w:r>
+      <w:r>
+        <w:rPr>
+          <w:i/>
+          <w:lang w:val="en-US"/>
+        </w:rPr>
+        <w:t>Placeholder</w:t>
+      </w:r>
+      <w:r>
+        <w:rPr>
+          <w:i/>
+        </w:rPr>
+        <w:t>_11</w:t>
+      </w:r>
+    </w:p>
+    <w:p>
+      <w:pPr>
+        <w:pStyle w:val="newncpi"/>
+        <w:ind w:left="927" w:firstLine="0"/>
+      </w:pPr>
+    </w:p>
+    <w:p>
+      <w:pPr>
+        <w:pStyle w:val="newncpi"/>
+        <w:ind w:left="927" w:firstLine="0"/>
+      </w:pPr>
+    </w:p>
+    <w:p>
+      <w:pPr>
+        <w:pStyle w:val="newncpi"/>
+      </w:pPr>
+      <w:r>
+        <w:t>Въезд на территорию будет осуществляться на автомобиле</w:t>
+      </w:r>
+      <w:r>
+        <w:t>:</w:t>
+      </w:r>
+    </w:p>
+    <w:p>
+      <w:pPr>
+        <w:pStyle w:val="newncpi"/>
+        <w:numPr>
+          <w:ilvl w:val="0"/>
+          <w:numId w:val="5"/>
+        </w:numPr>
+        <w:ind w:left="0" w:firstLine="567"/>
+        <w:rPr>
+          <w:i/>
+          <w:iCs/>
+        </w:rPr>
+      </w:pPr>
+      <w:r>
+        <w:rPr>
+          <w:i/>
+          <w:iCs/>
+        </w:rPr>
+        <w:t>Placeholder_12</w:t>
+      </w:r>
+      <w:r>
+        <w:rPr>
+          <w:i/>
+          <w:iCs/>
+        </w:rPr>
+        <w:t>,</w:t>
+      </w:r>
+      <w:r>
+        <w:rPr>
+          <w:i/>
+          <w:iCs/>
+        </w:rPr>
+        <w:t xml:space="preserve"> </w:t>
+      </w:r>
+      <w:r>
+        <w:rPr>
+          <w:i/>
+          <w:iCs/>
+        </w:rPr>
+        <w:t>Placeholder_13</w:t>
+      </w:r>
+    </w:p>
+    <w:p>
+      <w:pPr>
+        <w:pStyle w:val="newncpi"/>
+        <w:ind w:left="927" w:firstLine="0"/>
+      </w:pPr>
+    </w:p>
+    <w:p>
+      <w:pPr>
+        <w:rPr>
+          <w:rFonts w:ascii="Times New Roman" w:hAnsi="Times New Roman"/>
+          <w:sz w:val="24"/>
+          <w:szCs w:val="24"/>
+        </w:rPr>
+      </w:pPr>
+      <w:r>
+        <w:rPr>
+          <w:rFonts w:ascii="Times New Roman" w:hAnsi="Times New Roman"/>
+          <w:sz w:val="24"/>
+          <w:szCs w:val="24"/>
+        </w:rPr>
+        <w:t>Письменного ответа не требуется.</w:t>
+      </w:r>
+    </w:p>
+    <w:p>
+      <w:pPr>
+        <w:rPr>
+          <w:rFonts w:ascii="Times New Roman" w:hAnsi="Times New Roman"/>
+          <w:sz w:val="24"/>
+          <w:szCs w:val="24"/>
+        </w:rPr>
+      </w:pPr>
+      <w:r>
+        <w:rPr>
+          <w:rFonts w:ascii="Times New Roman" w:hAnsi="Times New Roman"/>
+          <w:sz w:val="24"/>
+          <w:szCs w:val="24"/>
+        </w:rPr>
+        <w:t>С мерами радиационной и пожарной безопасности ознакомлен(а).</w:t>
+      </w:r>
+    </w:p>
+    <w:p>
+      <w:pPr>
+        <w:pStyle w:val="aa"/>
+        <w:jc w:val="both"/>
+        <w:rPr>
+          <w:sz w:val="24"/>
+          <w:szCs w:val="24"/>
+        </w:rPr>
+      </w:pPr>
+      <w:r>
+        <w:rPr>
+          <w:sz w:val="24"/>
+          <w:szCs w:val="24"/>
+        </w:rPr>
+        <w:t xml:space="preserve">С правилами въезда (входа) в пограничную зону (полосу), </w:t>
+      </w:r>
+      <w:r>
+        <w:rPr>
+          <w:sz w:val="24"/>
+          <w:szCs w:val="24"/>
+        </w:rPr>
+        <w:t xml:space="preserve">порядком </w:t>
+      </w:r>
+      <w:r>
+        <w:rPr>
+          <w:sz w:val="24"/>
+          <w:szCs w:val="24"/>
+        </w:rPr>
+        <w:t xml:space="preserve">пребывания и передвижения в ней ознакомлен(а). </w:t>
+      </w:r>
+    </w:p>
+    <w:p>
+      <w:pPr>
+        <w:rPr>
+          <w:rFonts w:ascii="Times New Roman" w:hAnsi="Times New Roman"/>
+          <w:sz w:val="24"/>
+          <w:szCs w:val="24"/>
+        </w:rPr>
+      </w:pPr>
+    </w:p>
+    <w:p>
+      <w:pPr>
+        <w:rPr>
+          <w:rFonts w:ascii="Times New Roman" w:hAnsi="Times New Roman"/>
+          <w:sz w:val="24"/>
+          <w:szCs w:val="24"/>
+        </w:rPr>
+      </w:pPr>
+      <w:r>
+        <w:rPr>
+          <w:rFonts w:ascii="Times New Roman" w:hAnsi="Times New Roman"/>
           <w:i/>
           <w:sz w:val="28"/>
           <w:szCs w:val="28"/>
@@ -579,602 +985,28 @@
       </w:r>
       <w:r>
         <w:rPr>
+          <w:rFonts w:ascii="Times New Roman" w:hAnsi="Times New Roman"/>
           <w:i/>
           <w:sz w:val="28"/>
           <w:szCs w:val="28"/>
         </w:rPr>
-        <w:t>_</w:t>
-      </w:r>
-      <w:proofErr w:type="gramStart"/>
-      <w:r>
-        <w:rPr>
-          <w:i/>
-          <w:sz w:val="28"/>
-          <w:szCs w:val="28"/>
-        </w:rPr>
-        <w:t>4</w:t>
-      </w:r>
-      <w:r>
-        <w:rPr>
-          <w:i/>
-          <w:sz w:val="28"/>
-          <w:szCs w:val="28"/>
-        </w:rPr>
-        <w:t xml:space="preserve"> </w:t>
-      </w:r>
-      <w:r>
-        <w:t xml:space="preserve"> </w:t>
-      </w:r>
-      <w:r>
-        <w:t>районе</w:t>
-      </w:r>
-      <w:proofErr w:type="gramEnd"/>
-      <w:r>
-        <w:t>(ах) Гомельской области</w:t>
-      </w:r>
-      <w:r>
-        <w:t>,</w:t>
-      </w:r>
-    </w:p>
-    <w:p>
-      <w:pPr>
-        <w:pStyle w:val="newncpi"/>
-        <w:ind w:firstLine="0"/>
-      </w:pPr>
-      <w:r>
-        <w:t>на следующем(их) о</w:t>
-      </w:r>
-      <w:r>
-        <w:t xml:space="preserve">бъекте(ах) </w:t>
-      </w:r>
-    </w:p>
-    <w:p>
-      <w:pPr>
-        <w:pStyle w:val="undline"/>
-        <w:jc w:val="center"/>
-        <w:rPr>
-          <w:sz w:val="22"/>
-          <w:vertAlign w:val="superscript"/>
-        </w:rPr>
-      </w:pPr>
-      <w:r>
-        <w:rPr>
-          <w:i/>
-          <w:sz w:val="28"/>
-          <w:szCs w:val="28"/>
-          <w:lang w:val="en-US"/>
-        </w:rPr>
-        <w:t>Placeholder</w:t>
-      </w:r>
-      <w:r>
-        <w:rPr>
-          <w:i/>
-          <w:sz w:val="28"/>
-          <w:szCs w:val="28"/>
-        </w:rPr>
-        <w:t>_</w:t>
-      </w:r>
-      <w:r>
-        <w:rPr>
-          <w:i/>
-          <w:sz w:val="28"/>
-          <w:szCs w:val="28"/>
-        </w:rPr>
-        <w:t>5</w:t>
-      </w:r>
-      <w:r>
-        <w:rPr>
-          <w:sz w:val="22"/>
-          <w:vertAlign w:val="superscript"/>
-        </w:rPr>
-        <w:t xml:space="preserve"> </w:t>
-      </w:r>
-    </w:p>
-    <w:p>
-      <w:pPr>
-        <w:pStyle w:val="undline"/>
-        <w:jc w:val="center"/>
-        <w:rPr>
-          <w:sz w:val="22"/>
-          <w:vertAlign w:val="superscript"/>
-        </w:rPr>
-      </w:pPr>
-      <w:r>
-        <w:rPr>
-          <w:sz w:val="22"/>
-          <w:vertAlign w:val="superscript"/>
-        </w:rPr>
-        <w:t>(территория лесничества, отселенный населенный пункт, кладбище, иной объект, географические координаты и т.п.)</w:t>
-      </w:r>
-    </w:p>
-    <w:p>
-      <w:pPr>
-        <w:pStyle w:val="newncpi0"/>
-        <w:rPr>
-          <w:i/>
-          <w:sz w:val="28"/>
-          <w:szCs w:val="28"/>
-        </w:rPr>
-      </w:pPr>
-      <w:r>
-        <w:t>с целью</w:t>
-      </w:r>
-      <w:r>
-        <w:t>:</w:t>
-      </w:r>
-      <w:r>
-        <w:t xml:space="preserve"> </w:t>
-      </w:r>
-      <w:r>
-        <w:rPr>
-          <w:i/>
-          <w:sz w:val="28"/>
-          <w:szCs w:val="28"/>
-          <w:lang w:val="en-US"/>
-        </w:rPr>
-        <w:t>Placeholder</w:t>
-      </w:r>
-      <w:r>
-        <w:rPr>
-          <w:i/>
-          <w:sz w:val="28"/>
-          <w:szCs w:val="28"/>
-        </w:rPr>
-        <w:t>_6</w:t>
-      </w:r>
-    </w:p>
-    <w:p>
-      <w:pPr>
-        <w:pStyle w:val="newncpi0"/>
-      </w:pPr>
-      <w:r>
-        <w:rPr>
-          <w:i/>
-          <w:sz w:val="28"/>
-          <w:szCs w:val="28"/>
-        </w:rPr>
-        <w:t>____________________________________________________________________</w:t>
-      </w:r>
-    </w:p>
-    <w:p>
-      <w:pPr>
-        <w:pStyle w:val="newncpi0"/>
-      </w:pPr>
-      <w:r>
-        <w:t xml:space="preserve">на срок </w:t>
-      </w:r>
-      <w:r>
-        <w:rPr>
-          <w:i/>
-          <w:sz w:val="28"/>
-          <w:szCs w:val="28"/>
-        </w:rPr>
-        <w:t>с</w:t>
-      </w:r>
-      <w:r>
-        <w:rPr>
-          <w:i/>
-          <w:sz w:val="28"/>
-          <w:szCs w:val="28"/>
-        </w:rPr>
-        <w:t xml:space="preserve"> </w:t>
-      </w:r>
-      <w:r>
-        <w:rPr>
-          <w:i/>
-          <w:sz w:val="28"/>
-          <w:szCs w:val="28"/>
-          <w:lang w:val="en-US"/>
-        </w:rPr>
-        <w:t>Placeholder</w:t>
-      </w:r>
-      <w:r>
-        <w:rPr>
-          <w:i/>
-          <w:sz w:val="28"/>
-          <w:szCs w:val="28"/>
-        </w:rPr>
-        <w:t>_7</w:t>
-      </w:r>
-      <w:r>
-        <w:rPr>
-          <w:i/>
-          <w:sz w:val="28"/>
-          <w:szCs w:val="28"/>
-        </w:rPr>
-        <w:t>,</w:t>
-      </w:r>
-      <w:r>
-        <w:rPr>
-          <w:i/>
-          <w:sz w:val="28"/>
-          <w:szCs w:val="28"/>
-        </w:rPr>
-        <w:t xml:space="preserve"> по </w:t>
-      </w:r>
-      <w:r>
-        <w:rPr>
-          <w:i/>
-          <w:sz w:val="28"/>
-          <w:szCs w:val="28"/>
-          <w:lang w:val="en-US"/>
-        </w:rPr>
-        <w:t>Placeholder</w:t>
-      </w:r>
-      <w:r>
-        <w:rPr>
-          <w:i/>
-          <w:sz w:val="28"/>
-          <w:szCs w:val="28"/>
-        </w:rPr>
-        <w:t>_8</w:t>
-      </w:r>
-      <w:r>
-        <w:rPr>
-          <w:i/>
-          <w:sz w:val="28"/>
-          <w:szCs w:val="28"/>
-        </w:rPr>
-        <w:t>,</w:t>
-      </w:r>
-      <w:r>
-        <w:t xml:space="preserve"> для</w:t>
-      </w:r>
-      <w:r>
-        <w:t xml:space="preserve"> </w:t>
-      </w:r>
-      <w:r>
-        <w:t>меня лично и следующего(их) со мной:</w:t>
-      </w:r>
-    </w:p>
-    <w:p>
-      <w:pPr>
-        <w:pStyle w:val="newncpi0"/>
-      </w:pPr>
-    </w:p>
-    <w:tbl>
-      <w:tblPr>
-        <w:tblStyle w:val="af4"/>
-        <w:tblW w:w="4888" w:type="pct"/>
-        <w:tblBorders>
-          <w:top w:val="none" w:sz="0" w:space="0" w:color="auto"/>
-          <w:left w:val="none" w:sz="0" w:space="0" w:color="auto"/>
-          <w:bottom w:val="none" w:sz="0" w:space="0" w:color="auto"/>
-          <w:right w:val="none" w:sz="0" w:space="0" w:color="auto"/>
-          <w:insideH w:val="none" w:sz="0" w:space="0" w:color="auto"/>
-          <w:insideV w:val="none" w:sz="0" w:space="0" w:color="auto"/>
-        </w:tblBorders>
-        <w:tblLayout w:type="fixed"/>
-        <w:tblLook w:val="04A0" w:firstRow="1" w:lastRow="0" w:firstColumn="1" w:lastColumn="0" w:noHBand="0" w:noVBand="1"/>
-      </w:tblPr>
-      <w:tblGrid>
-        <w:gridCol w:w="534"/>
-        <w:gridCol w:w="9099"/>
-      </w:tblGrid>
-      <w:tr>
-        <w:trPr>
-          <w:trHeight w:val="253"/>
-        </w:trPr>
-        <w:tc>
-          <w:tcPr>
-            <w:tcW w:w="277" w:type="pct"/>
-          </w:tcPr>
-          <w:p>
-            <w:pPr>
-              <w:pStyle w:val="aa"/>
-              <w:rPr>
-                <w:sz w:val="28"/>
-                <w:szCs w:val="28"/>
-                <w:lang w:val="en-US"/>
-              </w:rPr>
-            </w:pPr>
-            <w:r>
-              <w:rPr>
-                <w:sz w:val="28"/>
-                <w:szCs w:val="28"/>
-                <w:lang w:val="en-US"/>
-              </w:rPr>
-              <w:t>1</w:t>
-            </w:r>
-          </w:p>
-        </w:tc>
-        <w:tc>
-          <w:tcPr>
-            <w:tcW w:w="4723" w:type="pct"/>
-          </w:tcPr>
-          <w:p>
-            <w:pPr>
-              <w:pStyle w:val="aa"/>
-              <w:rPr>
-                <w:i/>
-                <w:sz w:val="28"/>
-                <w:szCs w:val="28"/>
-              </w:rPr>
-            </w:pPr>
-            <w:r>
-              <w:rPr>
-                <w:rFonts w:ascii="Times New Roman" w:hAnsi="Times New Roman"/>
-                <w:i/>
-                <w:sz w:val="28"/>
-                <w:szCs w:val="28"/>
-                <w:lang w:val="en-US"/>
-              </w:rPr>
-              <w:t>Placeholder</w:t>
-            </w:r>
-            <w:r>
-              <w:rPr>
-                <w:rFonts w:ascii="Times New Roman" w:hAnsi="Times New Roman"/>
-                <w:i/>
-                <w:sz w:val="28"/>
-                <w:szCs w:val="28"/>
-              </w:rPr>
-              <w:t>_</w:t>
-            </w:r>
-            <w:r>
-              <w:rPr>
-                <w:i/>
-                <w:sz w:val="28"/>
-                <w:szCs w:val="28"/>
-              </w:rPr>
-              <w:t>10</w:t>
-            </w:r>
-            <w:r>
-              <w:rPr>
-                <w:i/>
-                <w:sz w:val="28"/>
-                <w:szCs w:val="28"/>
-              </w:rPr>
-              <w:t xml:space="preserve">.1 </w:t>
-            </w:r>
-            <w:r>
-              <w:rPr>
-                <w:rFonts w:ascii="Times New Roman" w:hAnsi="Times New Roman"/>
-                <w:i/>
-                <w:sz w:val="28"/>
-                <w:szCs w:val="28"/>
-                <w:lang w:val="en-US"/>
-              </w:rPr>
-              <w:t>Placeholder</w:t>
-            </w:r>
-            <w:r>
-              <w:rPr>
-                <w:rFonts w:ascii="Times New Roman" w:hAnsi="Times New Roman"/>
-                <w:i/>
-                <w:sz w:val="28"/>
-                <w:szCs w:val="28"/>
-              </w:rPr>
-              <w:t>_</w:t>
-            </w:r>
-            <w:r>
-              <w:rPr>
-                <w:i/>
-                <w:sz w:val="28"/>
-                <w:szCs w:val="28"/>
-              </w:rPr>
-              <w:t>10</w:t>
-            </w:r>
-            <w:r>
-              <w:rPr>
-                <w:i/>
-                <w:sz w:val="28"/>
-                <w:szCs w:val="28"/>
-              </w:rPr>
-              <w:t xml:space="preserve">.2 </w:t>
-            </w:r>
-            <w:r>
-              <w:rPr>
-                <w:rFonts w:ascii="Times New Roman" w:hAnsi="Times New Roman"/>
-                <w:i/>
-                <w:sz w:val="28"/>
-                <w:szCs w:val="28"/>
-                <w:lang w:val="en-US"/>
-              </w:rPr>
-              <w:t>Placeholder</w:t>
-            </w:r>
-            <w:r>
-              <w:rPr>
-                <w:rFonts w:ascii="Times New Roman" w:hAnsi="Times New Roman"/>
-                <w:i/>
-                <w:sz w:val="28"/>
-                <w:szCs w:val="28"/>
-              </w:rPr>
-              <w:t>_</w:t>
-            </w:r>
-            <w:r>
-              <w:rPr>
-                <w:i/>
-                <w:sz w:val="28"/>
-                <w:szCs w:val="28"/>
-                <w:lang w:val="en-US"/>
-              </w:rPr>
-              <w:t>10</w:t>
-            </w:r>
-            <w:r>
-              <w:rPr>
-                <w:i/>
-                <w:sz w:val="28"/>
-                <w:szCs w:val="28"/>
-              </w:rPr>
-              <w:t xml:space="preserve">.3, </w:t>
-            </w:r>
-            <w:r>
-              <w:rPr>
-                <w:rFonts w:ascii="Times New Roman" w:hAnsi="Times New Roman"/>
-                <w:i/>
-                <w:sz w:val="28"/>
-                <w:szCs w:val="28"/>
-                <w:lang w:val="en-US"/>
-              </w:rPr>
-              <w:t>Placeholder</w:t>
-            </w:r>
-            <w:r>
-              <w:rPr>
-                <w:rFonts w:ascii="Times New Roman" w:hAnsi="Times New Roman"/>
-                <w:i/>
-                <w:sz w:val="28"/>
-                <w:szCs w:val="28"/>
-              </w:rPr>
-              <w:t>_</w:t>
-            </w:r>
-            <w:r>
-              <w:rPr>
-                <w:i/>
-                <w:sz w:val="28"/>
-                <w:szCs w:val="28"/>
-              </w:rPr>
-              <w:t>11</w:t>
-            </w:r>
-          </w:p>
-        </w:tc>
-      </w:tr>
-      <w:tr>
-        <w:trPr>
-          <w:trHeight w:val="344"/>
-        </w:trPr>
-        <w:tc>
-          <w:tcPr>
-            <w:tcW w:w="277" w:type="pct"/>
-          </w:tcPr>
-          <w:p>
-            <w:pPr>
-              <w:pStyle w:val="aa"/>
-              <w:rPr>
-                <w:sz w:val="28"/>
-                <w:szCs w:val="28"/>
-              </w:rPr>
-            </w:pPr>
-            <w:r>
-              <w:rPr>
-                <w:sz w:val="28"/>
-                <w:szCs w:val="28"/>
-              </w:rPr>
-              <w:t>2</w:t>
-            </w:r>
-          </w:p>
-        </w:tc>
-        <w:tc>
-          <w:tcPr>
-            <w:tcW w:w="4723" w:type="pct"/>
-          </w:tcPr>
-          <w:p>
-            <w:pPr>
-              <w:pStyle w:val="aa"/>
-              <w:rPr>
-                <w:i/>
-                <w:sz w:val="28"/>
-                <w:szCs w:val="28"/>
-              </w:rPr>
-            </w:pPr>
-          </w:p>
-        </w:tc>
-      </w:tr>
-      <w:tr>
-        <w:trPr>
-          <w:trHeight w:val="817"/>
-        </w:trPr>
-        <w:tc>
-          <w:tcPr>
-            <w:tcW w:w="5000" w:type="pct"/>
-            <w:gridSpan w:val="2"/>
-          </w:tcPr>
-          <w:p>
-            <w:pPr>
-              <w:jc w:val="center"/>
-              <w:rPr>
-                <w:rFonts w:ascii="Times New Roman" w:hAnsi="Times New Roman"/>
-                <w:sz w:val="18"/>
-                <w:szCs w:val="18"/>
-                <w:vertAlign w:val="superscript"/>
-              </w:rPr>
-            </w:pPr>
-            <w:r>
-              <w:rPr>
-                <w:rFonts w:ascii="Times New Roman" w:hAnsi="Times New Roman"/>
-                <w:sz w:val="18"/>
-                <w:szCs w:val="18"/>
-                <w:vertAlign w:val="superscript"/>
-              </w:rPr>
-              <w:t xml:space="preserve">(для граждан Республики Беларусь: фамилия, имя отчество (если таковое имеется), дата рождения; </w:t>
-            </w:r>
-          </w:p>
-          <w:p>
-            <w:pPr>
-              <w:jc w:val="center"/>
-              <w:rPr>
-                <w:rFonts w:ascii="Times New Roman" w:hAnsi="Times New Roman"/>
-                <w:sz w:val="18"/>
-                <w:szCs w:val="18"/>
-                <w:vertAlign w:val="superscript"/>
-              </w:rPr>
-            </w:pPr>
-            <w:r>
-              <w:rPr>
-                <w:rFonts w:ascii="Times New Roman" w:hAnsi="Times New Roman"/>
-                <w:sz w:val="18"/>
-                <w:szCs w:val="18"/>
-                <w:vertAlign w:val="superscript"/>
-              </w:rPr>
-              <w:t xml:space="preserve">для иностранных граждан и лиц без гражданства: гражданство, фамилия, имя отчество (если таковое имеется), дата рождения, </w:t>
-            </w:r>
-          </w:p>
-          <w:p>
-            <w:pPr>
-              <w:jc w:val="center"/>
-              <w:rPr>
-                <w:rFonts w:ascii="Times New Roman" w:hAnsi="Times New Roman"/>
-                <w:sz w:val="18"/>
-                <w:szCs w:val="18"/>
-                <w:vertAlign w:val="superscript"/>
-              </w:rPr>
-            </w:pPr>
-            <w:r>
-              <w:rPr>
-                <w:rFonts w:ascii="Times New Roman" w:hAnsi="Times New Roman"/>
-                <w:sz w:val="18"/>
-                <w:szCs w:val="18"/>
-                <w:vertAlign w:val="superscript"/>
-              </w:rPr>
-              <w:t xml:space="preserve">данные документов, удостоверяющих личность (серия (при наличии), номер, дата выдачи, наименование органа, выдавшего </w:t>
-            </w:r>
-          </w:p>
-          <w:p>
-            <w:pPr>
-              <w:jc w:val="center"/>
-              <w:rPr>
-                <w:rFonts w:ascii="Times New Roman" w:hAnsi="Times New Roman"/>
-                <w:sz w:val="18"/>
-                <w:szCs w:val="18"/>
-                <w:vertAlign w:val="superscript"/>
-              </w:rPr>
-            </w:pPr>
-            <w:r>
-              <w:rPr>
-                <w:rFonts w:ascii="Times New Roman" w:hAnsi="Times New Roman"/>
-                <w:sz w:val="18"/>
-                <w:szCs w:val="18"/>
-                <w:vertAlign w:val="superscript"/>
-              </w:rPr>
-              <w:t>документ, идентификационный номер (при наличии)</w:t>
-            </w:r>
-          </w:p>
-        </w:tc>
-      </w:tr>
-    </w:tbl>
-    <w:p>
-      <w:pPr>
+        <w:t xml:space="preserve">_9  </w:t>
+      </w:r>
+      <w:r>
         <w:rPr>
           <w:rFonts w:ascii="Times New Roman" w:hAnsi="Times New Roman"/>
           <w:sz w:val="24"/>
           <w:szCs w:val="24"/>
         </w:rPr>
-      </w:pPr>
+        <w:tab/>
+      </w:r>
       <w:r>
         <w:rPr>
           <w:rFonts w:ascii="Times New Roman" w:hAnsi="Times New Roman"/>
           <w:sz w:val="24"/>
           <w:szCs w:val="24"/>
         </w:rPr>
-        <w:t>Въезд на территорию будет осуществляться на автомобиле</w:t>
+        <w:tab/>
       </w:r>
       <w:r>
         <w:rPr>
@@ -1182,269 +1014,33 @@
           <w:sz w:val="24"/>
           <w:szCs w:val="24"/>
         </w:rPr>
-        <w:t>:</w:t>
-      </w:r>
-    </w:p>
-    <w:tbl>
-      <w:tblPr>
-        <w:tblStyle w:val="af4"/>
-        <w:tblW w:w="4888" w:type="pct"/>
-        <w:tblBorders>
-          <w:top w:val="none" w:sz="0" w:space="0" w:color="auto"/>
-          <w:left w:val="none" w:sz="0" w:space="0" w:color="auto"/>
-          <w:bottom w:val="none" w:sz="0" w:space="0" w:color="auto"/>
-          <w:right w:val="none" w:sz="0" w:space="0" w:color="auto"/>
-          <w:insideH w:val="none" w:sz="0" w:space="0" w:color="auto"/>
-          <w:insideV w:val="none" w:sz="0" w:space="0" w:color="auto"/>
-        </w:tblBorders>
-        <w:tblLayout w:type="fixed"/>
-        <w:tblLook w:val="04A0" w:firstRow="1" w:lastRow="0" w:firstColumn="1" w:lastColumn="0" w:noHBand="0" w:noVBand="1"/>
-      </w:tblPr>
-      <w:tblGrid>
-        <w:gridCol w:w="534"/>
-        <w:gridCol w:w="5560"/>
-        <w:gridCol w:w="3539"/>
-      </w:tblGrid>
-      <w:tr>
-        <w:trPr>
-          <w:trHeight w:val="346"/>
-        </w:trPr>
-        <w:tc>
-          <w:tcPr>
-            <w:tcW w:w="277" w:type="pct"/>
-          </w:tcPr>
-          <w:p>
-            <w:pPr>
-              <w:pStyle w:val="aa"/>
-              <w:rPr>
-                <w:sz w:val="30"/>
-                <w:szCs w:val="30"/>
-                <w:lang w:val="en-US"/>
-              </w:rPr>
-            </w:pPr>
-            <w:r>
-              <w:rPr>
-                <w:sz w:val="30"/>
-                <w:szCs w:val="30"/>
-                <w:lang w:val="en-US"/>
-              </w:rPr>
-              <w:t>1</w:t>
-            </w:r>
-          </w:p>
-        </w:tc>
-        <w:tc>
-          <w:tcPr>
-            <w:tcW w:w="2886" w:type="pct"/>
-          </w:tcPr>
-          <w:p>
-            <w:pPr>
-              <w:pStyle w:val="aa"/>
-              <w:rPr>
-                <w:i/>
-                <w:sz w:val="30"/>
-                <w:szCs w:val="30"/>
-                <w:lang w:val="en-US"/>
-              </w:rPr>
-            </w:pPr>
-            <w:r>
-              <w:rPr>
-                <w:rFonts w:ascii="Times New Roman" w:hAnsi="Times New Roman"/>
-                <w:i/>
-                <w:sz w:val="28"/>
-                <w:szCs w:val="28"/>
-                <w:lang w:val="en-US"/>
-              </w:rPr>
-              <w:t>Placeholder</w:t>
-            </w:r>
-            <w:r>
-              <w:rPr>
-                <w:rFonts w:ascii="Times New Roman" w:hAnsi="Times New Roman"/>
-                <w:i/>
-                <w:sz w:val="28"/>
-                <w:szCs w:val="28"/>
-              </w:rPr>
-              <w:t>_</w:t>
-            </w:r>
-            <w:r>
-              <w:rPr>
-                <w:i/>
-                <w:sz w:val="28"/>
-                <w:szCs w:val="28"/>
-                <w:lang w:val="en-US"/>
-              </w:rPr>
-              <w:t>12</w:t>
-            </w:r>
-          </w:p>
-        </w:tc>
-        <w:tc>
-          <w:tcPr>
-            <w:tcW w:w="1837" w:type="pct"/>
-          </w:tcPr>
-          <w:p>
-            <w:pPr>
-              <w:pStyle w:val="aa"/>
-              <w:rPr>
-                <w:i/>
-                <w:sz w:val="30"/>
-                <w:szCs w:val="30"/>
-                <w:lang w:val="en-US"/>
-              </w:rPr>
-            </w:pPr>
-            <w:r>
-              <w:rPr>
-                <w:rFonts w:ascii="Times New Roman" w:hAnsi="Times New Roman"/>
-                <w:i/>
-                <w:sz w:val="28"/>
-                <w:szCs w:val="28"/>
-                <w:lang w:val="en-US"/>
-              </w:rPr>
-              <w:t>Placeholder</w:t>
-            </w:r>
-            <w:r>
-              <w:rPr>
-                <w:rFonts w:ascii="Times New Roman" w:hAnsi="Times New Roman"/>
-                <w:i/>
-                <w:sz w:val="28"/>
-                <w:szCs w:val="28"/>
-              </w:rPr>
-              <w:t>_</w:t>
-            </w:r>
-            <w:r>
-              <w:rPr>
-                <w:i/>
-                <w:sz w:val="28"/>
-                <w:szCs w:val="28"/>
-                <w:lang w:val="en-US"/>
-              </w:rPr>
-              <w:t>13</w:t>
-            </w:r>
-          </w:p>
-        </w:tc>
-      </w:tr>
-      <w:tr>
-        <w:trPr>
-          <w:trHeight w:val="355"/>
-        </w:trPr>
-        <w:tc>
-          <w:tcPr>
-            <w:tcW w:w="277" w:type="pct"/>
-          </w:tcPr>
-          <w:p>
-            <w:pPr>
-              <w:pStyle w:val="aa"/>
-              <w:rPr>
-                <w:sz w:val="30"/>
-                <w:szCs w:val="30"/>
-                <w:lang w:val="en-US"/>
-              </w:rPr>
-            </w:pPr>
-            <w:r>
-              <w:rPr>
-                <w:sz w:val="30"/>
-                <w:szCs w:val="30"/>
-                <w:lang w:val="en-US"/>
-              </w:rPr>
-              <w:t>2</w:t>
-            </w:r>
-          </w:p>
-        </w:tc>
-        <w:tc>
-          <w:tcPr>
-            <w:tcW w:w="2886" w:type="pct"/>
-          </w:tcPr>
-          <w:p>
-            <w:pPr>
-              <w:pStyle w:val="aa"/>
-              <w:rPr>
-                <w:i/>
-                <w:sz w:val="30"/>
-                <w:szCs w:val="30"/>
-              </w:rPr>
-            </w:pPr>
-          </w:p>
-        </w:tc>
-        <w:tc>
-          <w:tcPr>
-            <w:tcW w:w="1837" w:type="pct"/>
-          </w:tcPr>
-          <w:p>
-            <w:pPr>
-              <w:pStyle w:val="aa"/>
-              <w:rPr>
-                <w:i/>
-                <w:sz w:val="30"/>
-                <w:szCs w:val="30"/>
-              </w:rPr>
-            </w:pPr>
-          </w:p>
-        </w:tc>
-      </w:tr>
-      <w:tr>
-        <w:trPr>
-          <w:trHeight w:val="218"/>
-        </w:trPr>
-        <w:tc>
-          <w:tcPr>
-            <w:tcW w:w="5000" w:type="pct"/>
-            <w:gridSpan w:val="3"/>
-          </w:tcPr>
-          <w:p>
-            <w:pPr>
-              <w:jc w:val="center"/>
-              <w:rPr>
-                <w:rFonts w:ascii="Times New Roman" w:hAnsi="Times New Roman"/>
-                <w:sz w:val="18"/>
-                <w:szCs w:val="18"/>
-                <w:vertAlign w:val="superscript"/>
-              </w:rPr>
-            </w:pPr>
-            <w:r>
-              <w:rPr>
-                <w:rFonts w:ascii="Times New Roman" w:hAnsi="Times New Roman"/>
-                <w:sz w:val="24"/>
-                <w:szCs w:val="24"/>
-                <w:vertAlign w:val="superscript"/>
-              </w:rPr>
-              <w:t>(</w:t>
-            </w:r>
-            <w:r>
-              <w:rPr>
-                <w:rFonts w:ascii="Times New Roman" w:hAnsi="Times New Roman"/>
-                <w:sz w:val="24"/>
-                <w:szCs w:val="20"/>
-                <w:vertAlign w:val="superscript"/>
-              </w:rPr>
-              <w:t>марка-модель и регистрационный знак)</w:t>
-            </w:r>
-          </w:p>
-        </w:tc>
-      </w:tr>
-    </w:tbl>
-    <w:p>
-      <w:pPr>
+        <w:t xml:space="preserve">           </w:t>
+      </w:r>
+      <w:r>
         <w:rPr>
           <w:rFonts w:ascii="Times New Roman" w:hAnsi="Times New Roman"/>
           <w:sz w:val="24"/>
           <w:szCs w:val="24"/>
         </w:rPr>
-      </w:pPr>
-    </w:p>
-    <w:p>
-      <w:pPr>
+        <w:t xml:space="preserve">Подпись </w:t>
+      </w:r>
+      <w:r>
         <w:rPr>
           <w:rFonts w:ascii="Times New Roman" w:hAnsi="Times New Roman"/>
           <w:sz w:val="24"/>
           <w:szCs w:val="24"/>
         </w:rPr>
-      </w:pPr>
-      <w:r>
+        <w:t>___________________________________</w:t>
+      </w:r>
+    </w:p>
+    <w:p>
+      <w:pPr>
         <w:rPr>
           <w:rFonts w:ascii="Times New Roman" w:hAnsi="Times New Roman"/>
           <w:sz w:val="24"/>
           <w:szCs w:val="24"/>
         </w:rPr>
-        <w:t>Письменного ответа не требуется.</w:t>
-      </w:r>
+      </w:pPr>
     </w:p>
     <w:p>
       <w:pPr>
@@ -1454,81 +1050,30 @@
           <w:szCs w:val="24"/>
         </w:rPr>
       </w:pPr>
-      <w:r>
+    </w:p>
+    <w:p>
+      <w:pPr>
         <w:rPr>
           <w:rFonts w:ascii="Times New Roman" w:hAnsi="Times New Roman"/>
           <w:sz w:val="24"/>
           <w:szCs w:val="24"/>
         </w:rPr>
-        <w:t>С мерами радиационной и пожарной безопасности ознакомлен(а).</w:t>
-      </w:r>
-    </w:p>
-    <w:p>
-      <w:pPr>
-        <w:pStyle w:val="aa"/>
-        <w:jc w:val="both"/>
-        <w:rPr>
-          <w:sz w:val="24"/>
-          <w:szCs w:val="24"/>
-        </w:rPr>
-      </w:pPr>
-      <w:r>
-        <w:rPr>
-          <w:sz w:val="24"/>
-          <w:szCs w:val="24"/>
-        </w:rPr>
-        <w:t xml:space="preserve">С правилами въезда (входа) в пограничную зону (полосу), </w:t>
-      </w:r>
-      <w:r>
-        <w:rPr>
-          <w:sz w:val="24"/>
-          <w:szCs w:val="24"/>
-        </w:rPr>
-        <w:t xml:space="preserve">порядком </w:t>
-      </w:r>
-      <w:r>
-        <w:rPr>
-          <w:sz w:val="24"/>
-          <w:szCs w:val="24"/>
-        </w:rPr>
-        <w:t xml:space="preserve">пребывания и передвижения в ней ознакомлен(а). </w:t>
-      </w:r>
-    </w:p>
-    <w:p>
-      <w:pPr>
+      </w:pPr>
+      <w:r>
         <w:rPr>
           <w:rFonts w:ascii="Times New Roman" w:hAnsi="Times New Roman"/>
           <w:sz w:val="24"/>
           <w:szCs w:val="24"/>
         </w:rPr>
-      </w:pPr>
-    </w:p>
-    <w:p>
-      <w:pPr>
+        <w:t>Пропуск</w:t>
+      </w:r>
+      <w:r>
         <w:rPr>
           <w:rFonts w:ascii="Times New Roman" w:hAnsi="Times New Roman"/>
           <w:sz w:val="24"/>
           <w:szCs w:val="24"/>
         </w:rPr>
-      </w:pPr>
-      <w:r>
-        <w:rPr>
-          <w:rFonts w:ascii="Times New Roman" w:hAnsi="Times New Roman"/>
-          <w:i/>
-          <w:sz w:val="28"/>
-          <w:szCs w:val="28"/>
-          <w:lang w:val="en-US"/>
-        </w:rPr>
-        <w:t>Placeholder</w:t>
-      </w:r>
-      <w:r>
-        <w:rPr>
-          <w:rFonts w:ascii="Times New Roman" w:hAnsi="Times New Roman"/>
-          <w:i/>
-          <w:sz w:val="28"/>
-          <w:szCs w:val="28"/>
-        </w:rPr>
-        <w:t xml:space="preserve">_9  </w:t>
+        <w:t>(а)</w:t>
       </w:r>
       <w:r>
         <w:rPr>
@@ -1536,95 +1081,12 @@
           <w:sz w:val="24"/>
           <w:szCs w:val="24"/>
         </w:rPr>
-        <w:tab/>
+        <w:t xml:space="preserve"> </w:t>
       </w:r>
       <w:r>
         <w:rPr>
           <w:rFonts w:ascii="Times New Roman" w:hAnsi="Times New Roman"/>
-          <w:sz w:val="24"/>
-          <w:szCs w:val="24"/>
-        </w:rPr>
-        <w:tab/>
-      </w:r>
-      <w:r>
-        <w:rPr>
-          <w:rFonts w:ascii="Times New Roman" w:hAnsi="Times New Roman"/>
-          <w:sz w:val="24"/>
-          <w:szCs w:val="24"/>
-        </w:rPr>
-        <w:t xml:space="preserve">           </w:t>
-      </w:r>
-      <w:r>
-        <w:rPr>
-          <w:rFonts w:ascii="Times New Roman" w:hAnsi="Times New Roman"/>
-          <w:sz w:val="24"/>
-          <w:szCs w:val="24"/>
-        </w:rPr>
-        <w:t xml:space="preserve">Подпись </w:t>
-      </w:r>
-      <w:r>
-        <w:rPr>
-          <w:rFonts w:ascii="Times New Roman" w:hAnsi="Times New Roman"/>
-          <w:sz w:val="24"/>
-          <w:szCs w:val="24"/>
-        </w:rPr>
-        <w:t>___________________________________</w:t>
-      </w:r>
-    </w:p>
-    <w:p>
-      <w:pPr>
-        <w:rPr>
-          <w:rFonts w:ascii="Times New Roman" w:hAnsi="Times New Roman"/>
-          <w:sz w:val="24"/>
-          <w:szCs w:val="24"/>
-        </w:rPr>
-      </w:pPr>
-    </w:p>
-    <w:p>
-      <w:pPr>
-        <w:rPr>
-          <w:rFonts w:ascii="Times New Roman" w:hAnsi="Times New Roman"/>
-          <w:sz w:val="24"/>
-          <w:szCs w:val="24"/>
-        </w:rPr>
-      </w:pPr>
-    </w:p>
-    <w:p>
-      <w:pPr>
-        <w:rPr>
-          <w:rFonts w:ascii="Times New Roman" w:hAnsi="Times New Roman"/>
-          <w:sz w:val="24"/>
-          <w:szCs w:val="24"/>
-        </w:rPr>
-      </w:pPr>
-      <w:r>
-        <w:rPr>
-          <w:rFonts w:ascii="Times New Roman" w:hAnsi="Times New Roman"/>
-          <w:sz w:val="24"/>
-          <w:szCs w:val="24"/>
-        </w:rPr>
-        <w:t>Пропуск</w:t>
-      </w:r>
-      <w:r>
-        <w:rPr>
-          <w:rFonts w:ascii="Times New Roman" w:hAnsi="Times New Roman"/>
-          <w:sz w:val="24"/>
-          <w:szCs w:val="24"/>
-        </w:rPr>
-        <w:t>(а)</w:t>
-      </w:r>
-      <w:r>
-        <w:rPr>
-          <w:rFonts w:ascii="Times New Roman" w:hAnsi="Times New Roman"/>
-          <w:sz w:val="24"/>
-          <w:szCs w:val="24"/>
-        </w:rPr>
-        <w:t xml:space="preserve"> </w:t>
-      </w:r>
-      <w:r>
-        <w:rPr>
-          <w:rFonts w:ascii="Times New Roman" w:hAnsi="Times New Roman"/>
-          <w:b/>
+          <w:bCs/>
           <w:sz w:val="28"/>
           <w:szCs w:val="28"/>
         </w:rPr>
@@ -1857,6 +1319,97 @@
     </w:lvl>
   </w:abstractNum>
   <w:abstractNum w:abstractNumId="1" w15:restartNumberingAfterBreak="0">
+    <w:nsid w:val="3C6816B9"/>
+    <w:multiLevelType w:val="hybridMultilevel"/>
+    <w:tmpl w:val="E730E078"/>
+    <w:lvl w:ilvl="0" w:tplc="D76001C4">
+      <w:start w:val="1"/>
+      <w:numFmt w:val="decimal"/>
+      <w:lvlText w:val="%1."/>
+      <w:lvlJc w:val="left"/>
+      <w:pPr>
+        <w:ind w:left="927" w:hanging="360"/>
+      </w:pPr>
+      <w:rPr>
+        <w:rFonts w:hint="default"/>
+        <w:sz w:val="24"/>
+        <w:szCs w:val="24"/>
+      </w:rPr>
+    </w:lvl>
+    <w:lvl w:ilvl="1" w:tplc="04190019" w:tentative="1">
+      <w:start w:val="1"/>
+      <w:numFmt w:val="lowerLetter"/>
+      <w:lvlText w:val="%2."/>
+      <w:lvlJc w:val="left"/>
+      <w:pPr>
+        <w:ind w:left="1647" w:hanging="360"/>
+      </w:pPr>
+    </w:lvl>
+    <w:lvl w:ilvl="2" w:tplc="0419001B" w:tentative="1">
+      <w:start w:val="1"/>
+      <w:numFmt w:val="lowerRoman"/>
+      <w:lvlText w:val="%3."/>
+      <w:lvlJc w:val="right"/>
+      <w:pPr>
+        <w:ind w:left="2367" w:hanging="180"/>
+      </w:pPr>
+    </w:lvl>
+    <w:lvl w:ilvl="3" w:tplc="0419000F" w:tentative="1">
+      <w:start w:val="1"/>
+      <w:numFmt w:val="decimal"/>
+      <w:lvlText w:val="%4."/>
+      <w:lvlJc w:val="left"/>
+      <w:pPr>
+        <w:ind w:left="3087" w:hanging="360"/>
+      </w:pPr>
+    </w:lvl>
+    <w:lvl w:ilvl="4" w:tplc="04190019" w:tentative="1">
+      <w:start w:val="1"/>
+      <w:numFmt w:val="lowerLetter"/>
+      <w:lvlText w:val="%5."/>
+      <w:lvlJc w:val="left"/>
+      <w:pPr>
+        <w:ind w:left="3807" w:hanging="360"/>
+      </w:pPr>
+    </w:lvl>
+    <w:lvl w:ilvl="5" w:tplc="0419001B" w:tentative="1">
+      <w:start w:val="1"/>
+      <w:numFmt w:val="lowerRoman"/>
+      <w:lvlText w:val="%6."/>
+      <w:lvlJc w:val="right"/>
+      <w:pPr>
+        <w:ind w:left="4527" w:hanging="180"/>
+      </w:pPr>
+    </w:lvl>
+    <w:lvl w:ilvl="6" w:tplc="0419000F" w:tentative="1">
+      <w:start w:val="1"/>
+      <w:numFmt w:val="decimal"/>
+      <w:lvlText w:val="%7."/>
+      <w:lvlJc w:val="left"/>
+      <w:pPr>
+        <w:ind w:left="5247" w:hanging="360"/>
+      </w:pPr>
+    </w:lvl>
+    <w:lvl w:ilvl="7" w:tplc="04190019" w:tentative="1">
+      <w:start w:val="1"/>
+      <w:numFmt w:val="lowerLetter"/>
+      <w:lvlText w:val="%8."/>
+      <w:lvlJc w:val="left"/>
+      <w:pPr>
+        <w:ind w:left="5967" w:hanging="360"/>
+      </w:pPr>
+    </w:lvl>
+    <w:lvl w:ilvl="8" w:tplc="0419001B" w:tentative="1">
+      <w:start w:val="1"/>
+      <w:numFmt w:val="lowerRoman"/>
+      <w:lvlText w:val="%9."/>
+      <w:lvlJc w:val="right"/>
+      <w:pPr>
+        <w:ind w:left="6687" w:hanging="180"/>
+      </w:pPr>
+    </w:lvl>
+  </w:abstractNum>
+  <w:abstractNum w:abstractNumId="2" w15:restartNumberingAfterBreak="0">
     <w:nsid w:val="492B48AA"/>
     <w:multiLevelType w:val="hybridMultilevel"/>
     <w:tmpl w:val="7FFA0FF8"/>
@@ -1945,7 +1498,100 @@
       </w:pPr>
     </w:lvl>
   </w:abstractNum>
-  <w:abstractNum w:abstractNumId="2" w15:restartNumberingAfterBreak="0">
+  <w:abstractNum w:abstractNumId="3" w15:restartNumberingAfterBreak="0">
+    <w:nsid w:val="59FD00C6"/>
+    <w:multiLevelType w:val="hybridMultilevel"/>
+    <w:tmpl w:val="EB9C708C"/>
+    <w:lvl w:ilvl="0" w:tplc="10A4A524">
+      <w:start w:val="1"/>
+      <w:numFmt w:val="decimal"/>
+      <w:lvlText w:val="%1."/>
+      <w:lvlJc w:val="left"/>
+      <w:pPr>
+        <w:ind w:left="1287" w:hanging="360"/>
+      </w:pPr>
+      <w:rPr>
+        <w:rFonts w:hint="default"/>
+        <w:i w:val="0"/>
+        <w:iCs w:val="0"/>
+        <w:sz w:val="24"/>
+        <w:szCs w:val="24"/>
+      </w:rPr>
+    </w:lvl>
+    <w:lvl w:ilvl="1" w:tplc="04190019" w:tentative="1">
+      <w:start w:val="1"/>
+      <w:numFmt w:val="lowerLetter"/>
+      <w:lvlText w:val="%2."/>
+      <w:lvlJc w:val="left"/>
+      <w:pPr>
+        <w:ind w:left="2007" w:hanging="360"/>
+      </w:pPr>
+    </w:lvl>
+    <w:lvl w:ilvl="2" w:tplc="0419001B" w:tentative="1">
+      <w:start w:val="1"/>
+      <w:numFmt w:val="lowerRoman"/>
+      <w:lvlText w:val="%3."/>
+      <w:lvlJc w:val="right"/>
+      <w:pPr>
+        <w:ind w:left="2727" w:hanging="180"/>
+      </w:pPr>
+    </w:lvl>
+    <w:lvl w:ilvl="3" w:tplc="0419000F" w:tentative="1">
+      <w:start w:val="1"/>
+      <w:numFmt w:val="decimal"/>
+      <w:lvlText w:val="%4."/>
+      <w:lvlJc w:val="left"/>
+      <w:pPr>
+        <w:ind w:left="3447" w:hanging="360"/>
+      </w:pPr>
+    </w:lvl>
+    <w:lvl w:ilvl="4" w:tplc="04190019" w:tentative="1">
+      <w:start w:val="1"/>
+      <w:numFmt w:val="lowerLetter"/>
+      <w:lvlText w:val="%5."/>
+      <w:lvlJc w:val="left"/>
+      <w:pPr>
+        <w:ind w:left="4167" w:hanging="360"/>
+      </w:pPr>
+    </w:lvl>
+    <w:lvl w:ilvl="5" w:tplc="0419001B" w:tentative="1">
+      <w:start w:val="1"/>
+      <w:numFmt w:val="lowerRoman"/>
+      <w:lvlText w:val="%6."/>
+      <w:lvlJc w:val="right"/>
+      <w:pPr>
+        <w:ind w:left="4887" w:hanging="180"/>
+      </w:pPr>
+    </w:lvl>
+    <w:lvl w:ilvl="6" w:tplc="0419000F" w:tentative="1">
+      <w:start w:val="1"/>
+      <w:numFmt w:val="decimal"/>
+      <w:lvlText w:val="%7."/>
+      <w:lvlJc w:val="left"/>
+      <w:pPr>
+        <w:ind w:left="5607" w:hanging="360"/>
+      </w:pPr>
+    </w:lvl>
+    <w:lvl w:ilvl="7" w:tplc="04190019" w:tentative="1">
+      <w:start w:val="1"/>
+      <w:numFmt w:val="lowerLetter"/>
+      <w:lvlText w:val="%8."/>
+      <w:lvlJc w:val="left"/>
+      <w:pPr>
+        <w:ind w:left="6327" w:hanging="360"/>
+      </w:pPr>
+    </w:lvl>
+    <w:lvl w:ilvl="8" w:tplc="0419001B" w:tentative="1">
+      <w:start w:val="1"/>
+      <w:numFmt w:val="lowerRoman"/>
+      <w:lvlText w:val="%9."/>
+      <w:lvlJc w:val="right"/>
+      <w:pPr>
+        <w:ind w:left="7047" w:hanging="180"/>
+      </w:pPr>
+    </w:lvl>
+  </w:abstractNum>
+  <w:abstractNum w:abstractNumId="4" w15:restartNumberingAfterBreak="0">
     <w:nsid w:val="7B2A4207"/>
     <w:multiLevelType w:val="hybridMultilevel"/>
     <w:tmpl w:val="8FAC2B1A"/>
@@ -2038,10 +1684,16 @@
     <w:abstractNumId w:val="0"/>
   </w:num>
   <w:num w:numId="2" w16cid:durableId="248854168">
+    <w:abstractNumId w:val="4"/>
+  </w:num>
+  <w:num w:numId="3" w16cid:durableId="615913429">
     <w:abstractNumId w:val="2"/>
   </w:num>
-  <w:num w:numId="3" w16cid:durableId="615913429">
+  <w:num w:numId="4" w16cid:durableId="1791433051">
     <w:abstractNumId w:val="1"/>
+  </w:num>
+  <w:num w:numId="5" w16cid:durableId="1494369167">
+    <w:abstractNumId w:val="3"/>
   </w:num>
 </w:numbering>
 </file>

</xml_diff>

<commit_message>
v0.1.17: 14.5 application without goal/car placeholders, with date; updated templates (7 forms)
</commit_message>
<xml_diff>
--- a/templates/Заявление_14.3.docx
+++ b/templates/Заявление_14.3.docx
@@ -6,6 +6,7 @@
       <w:tblPr>
         <w:tblStyle w:val="af4"/>
         <w:tblW w:w="5000" w:type="pct"/>
+        <w:jc w:val="center"/>
         <w:tblBorders>
           <w:top w:val="none" w:sz="0" w:space="0" w:color="auto"/>
           <w:left w:val="none" w:sz="0" w:space="0" w:color="auto"/>
@@ -20,7 +21,8 @@
       </w:tblGrid>
       <w:tr>
         <w:trPr>
-          <w:trHeight w:val="606"/>
+          <w:trHeight w:val="1333"/>
+          <w:jc w:val="center"/>
         </w:trPr>
         <w:tc>
           <w:tcPr>
@@ -34,18 +36,18 @@
           <w:p>
             <w:pPr>
               <w:spacing w:line="280" w:lineRule="exact"/>
-              <w:ind w:right="471"/>
+              <w:ind w:right="151"/>
               <w:rPr>
                 <w:rFonts w:ascii="Times New Roman" w:hAnsi="Times New Roman"/>
-                <w:sz w:val="24"/>
-                <w:szCs w:val="24"/>
+                <w:sz w:val="28"/>
+                <w:szCs w:val="28"/>
               </w:rPr>
             </w:pPr>
             <w:r>
               <w:rPr>
                 <w:rFonts w:ascii="Times New Roman" w:hAnsi="Times New Roman"/>
-                <w:sz w:val="24"/>
-                <w:szCs w:val="24"/>
+                <w:sz w:val="28"/>
+                <w:szCs w:val="28"/>
               </w:rPr>
               <w:t>ЗАЯВЛЕНИЕ</w:t>
             </w:r>
@@ -53,92 +55,20 @@
           <w:p>
             <w:pPr>
               <w:spacing w:line="280" w:lineRule="exact"/>
-              <w:ind w:right="471"/>
+              <w:ind w:right="151"/>
               <w:rPr>
                 <w:rFonts w:ascii="Times New Roman" w:hAnsi="Times New Roman"/>
-                <w:sz w:val="24"/>
-                <w:szCs w:val="24"/>
+                <w:sz w:val="28"/>
+                <w:szCs w:val="28"/>
               </w:rPr>
             </w:pPr>
             <w:r>
               <w:rPr>
                 <w:rFonts w:ascii="Times New Roman" w:hAnsi="Times New Roman"/>
-                <w:sz w:val="24"/>
-                <w:szCs w:val="24"/>
+                <w:sz w:val="28"/>
+                <w:szCs w:val="28"/>
               </w:rPr>
-              <w:t xml:space="preserve">на осуществление административной процедуры </w:t>
-            </w:r>
-            <w:r>
-              <w:rPr>
-                <w:rFonts w:ascii="Times New Roman" w:hAnsi="Times New Roman"/>
-                <w:sz w:val="24"/>
-                <w:szCs w:val="24"/>
-              </w:rPr>
-              <w:t>в соответствии с пункт</w:t>
-            </w:r>
-            <w:r>
-              <w:rPr>
-                <w:rFonts w:ascii="Times New Roman" w:hAnsi="Times New Roman"/>
-                <w:sz w:val="24"/>
-                <w:szCs w:val="24"/>
-              </w:rPr>
-              <w:t>о</w:t>
-            </w:r>
-            <w:r>
-              <w:rPr>
-                <w:rFonts w:ascii="Times New Roman" w:hAnsi="Times New Roman"/>
-                <w:sz w:val="24"/>
-                <w:szCs w:val="24"/>
-              </w:rPr>
-              <w:t>м 14.3 перечня административных процедур, осуществляемых государственными органами и иными организациями по заявлениям граждан, утвержденного Указом Президента Республики Беларусь</w:t>
-            </w:r>
-            <w:r>
-              <w:rPr>
-                <w:rFonts w:ascii="Times New Roman" w:hAnsi="Times New Roman"/>
-                <w:sz w:val="24"/>
-                <w:szCs w:val="24"/>
-              </w:rPr>
-              <w:t xml:space="preserve"> </w:t>
-            </w:r>
-            <w:r>
-              <w:rPr>
-                <w:rFonts w:ascii="Times New Roman" w:hAnsi="Times New Roman"/>
-                <w:sz w:val="24"/>
-                <w:szCs w:val="24"/>
-              </w:rPr>
-              <w:t xml:space="preserve">от </w:t>
-            </w:r>
-            <w:r>
-              <w:rPr>
-                <w:rFonts w:ascii="Times New Roman" w:hAnsi="Times New Roman"/>
-                <w:sz w:val="24"/>
-                <w:szCs w:val="24"/>
-              </w:rPr>
-              <w:t>26.04.2010</w:t>
-            </w:r>
-            <w:r>
-              <w:rPr>
-                <w:rFonts w:ascii="Times New Roman" w:hAnsi="Times New Roman"/>
-                <w:sz w:val="24"/>
-                <w:szCs w:val="24"/>
-              </w:rPr>
-              <w:t xml:space="preserve"> </w:t>
-            </w:r>
-            <w:r>
-              <w:rPr>
-                <w:rFonts w:ascii="Times New Roman" w:hAnsi="Times New Roman"/>
-                <w:sz w:val="24"/>
-                <w:szCs w:val="24"/>
-              </w:rPr>
-              <w:t>№ </w:t>
-            </w:r>
-            <w:r>
-              <w:rPr>
-                <w:rFonts w:ascii="Times New Roman" w:hAnsi="Times New Roman"/>
-                <w:sz w:val="24"/>
-                <w:szCs w:val="24"/>
-              </w:rPr>
-              <w:t>200</w:t>
+              <w:t>на осуществление административной процедуры в соответствии с пунктом 14.3 перечня административных процедур, осуществляемых государственными органами и иными организациями по заявлениям граждан, утвержденного Указом Президента Республики Беларусь от 26.04.2010 № 200</w:t>
             </w:r>
           </w:p>
         </w:tc>
@@ -154,19 +84,18 @@
           <w:p>
             <w:pPr>
               <w:spacing w:line="280" w:lineRule="exact"/>
-              <w:ind w:left="-108"/>
               <w:jc w:val="both"/>
               <w:rPr>
                 <w:rFonts w:ascii="Times New Roman" w:hAnsi="Times New Roman"/>
-                <w:sz w:val="24"/>
-                <w:szCs w:val="24"/>
+                <w:sz w:val="28"/>
+                <w:szCs w:val="28"/>
               </w:rPr>
             </w:pPr>
             <w:r>
               <w:rPr>
                 <w:rFonts w:ascii="Times New Roman" w:hAnsi="Times New Roman"/>
-                <w:sz w:val="24"/>
-                <w:szCs w:val="24"/>
+                <w:sz w:val="28"/>
+                <w:szCs w:val="28"/>
               </w:rPr>
               <w:t xml:space="preserve">Главное управление по проблемам ликвидации последствий катастрофы на Чернобыльской АЭС Гомельского областного исполнительного комитета </w:t>
             </w:r>
@@ -175,7 +104,8 @@
       </w:tr>
       <w:tr>
         <w:trPr>
-          <w:trHeight w:val="290"/>
+          <w:trHeight w:val="703"/>
+          <w:jc w:val="center"/>
         </w:trPr>
         <w:tc>
           <w:tcPr>
@@ -187,11 +117,12 @@
           </w:tcPr>
           <w:p>
             <w:pPr>
+              <w:spacing w:line="280" w:lineRule="exact"/>
               <w:jc w:val="both"/>
               <w:rPr>
                 <w:rFonts w:ascii="Times New Roman" w:hAnsi="Times New Roman"/>
-                <w:sz w:val="24"/>
-                <w:szCs w:val="24"/>
+                <w:sz w:val="28"/>
+                <w:szCs w:val="28"/>
               </w:rPr>
             </w:pPr>
           </w:p>
@@ -204,9 +135,11 @@
               <w:left w:val="nil"/>
               <w:bottom w:val="single" w:sz="4" w:space="0" w:color="auto"/>
             </w:tcBorders>
+            <w:vAlign w:val="bottom"/>
           </w:tcPr>
           <w:p>
             <w:pPr>
+              <w:spacing w:line="280" w:lineRule="exact"/>
               <w:jc w:val="center"/>
               <w:rPr>
                 <w:rFonts w:ascii="Times New Roman" w:hAnsi="Times New Roman"/>
@@ -241,16 +174,7 @@
                 <w:sz w:val="28"/>
                 <w:szCs w:val="28"/>
               </w:rPr>
-              <w:t>.1</w:t>
-            </w:r>
-            <w:r>
-              <w:rPr>
-                <w:rFonts w:ascii="Times New Roman" w:hAnsi="Times New Roman"/>
-                <w:i/>
-                <w:sz w:val="28"/>
-                <w:szCs w:val="28"/>
-              </w:rPr>
-              <w:t xml:space="preserve"> </w:t>
+              <w:t xml:space="preserve">.1 </w:t>
             </w:r>
             <w:r>
               <w:rPr>
@@ -269,25 +193,7 @@
                 <w:sz w:val="28"/>
                 <w:szCs w:val="28"/>
               </w:rPr>
-              <w:t>_1</w:t>
-            </w:r>
-            <w:r>
-              <w:rPr>
-                <w:rFonts w:ascii="Times New Roman" w:hAnsi="Times New Roman"/>
-                <w:i/>
-                <w:sz w:val="28"/>
-                <w:szCs w:val="28"/>
-              </w:rPr>
-              <w:t>.2</w:t>
-            </w:r>
-            <w:r>
-              <w:rPr>
-                <w:rFonts w:ascii="Times New Roman" w:hAnsi="Times New Roman"/>
-                <w:i/>
-                <w:sz w:val="28"/>
-                <w:szCs w:val="28"/>
-              </w:rPr>
-              <w:t xml:space="preserve"> </w:t>
+              <w:t xml:space="preserve">_1.2 </w:t>
             </w:r>
             <w:r>
               <w:rPr>
@@ -306,7 +212,7 @@
                 <w:sz w:val="28"/>
                 <w:szCs w:val="28"/>
               </w:rPr>
-              <w:t>_1</w:t>
+              <w:t>_1.3</w:t>
             </w:r>
             <w:r>
               <w:rPr>
@@ -315,14 +221,15 @@
                 <w:sz w:val="28"/>
                 <w:szCs w:val="28"/>
               </w:rPr>
-              <w:t>.3</w:t>
+              <w:t>,</w:t>
             </w:r>
           </w:p>
         </w:tc>
       </w:tr>
       <w:tr>
         <w:trPr>
-          <w:trHeight w:val="560"/>
+          <w:trHeight w:val="415"/>
+          <w:jc w:val="center"/>
         </w:trPr>
         <w:tc>
           <w:tcPr>
@@ -334,11 +241,12 @@
           </w:tcPr>
           <w:p>
             <w:pPr>
+              <w:spacing w:line="280" w:lineRule="exact"/>
               <w:jc w:val="both"/>
               <w:rPr>
                 <w:rFonts w:ascii="Times New Roman" w:hAnsi="Times New Roman"/>
-                <w:sz w:val="24"/>
-                <w:szCs w:val="24"/>
+                <w:sz w:val="28"/>
+                <w:szCs w:val="28"/>
               </w:rPr>
             </w:pPr>
           </w:p>
@@ -351,31 +259,11 @@
               <w:left w:val="nil"/>
               <w:bottom w:val="single" w:sz="4" w:space="0" w:color="auto"/>
             </w:tcBorders>
+            <w:vAlign w:val="bottom"/>
           </w:tcPr>
           <w:p>
             <w:pPr>
-              <w:ind w:left="-109"/>
-              <w:jc w:val="center"/>
-              <w:rPr>
-                <w:rFonts w:ascii="Times New Roman" w:hAnsi="Times New Roman"/>
-                <w:sz w:val="18"/>
-                <w:szCs w:val="18"/>
-                <w:vertAlign w:val="superscript"/>
-              </w:rPr>
-            </w:pPr>
-            <w:r>
-              <w:rPr>
-                <w:rFonts w:ascii="Times New Roman" w:hAnsi="Times New Roman"/>
-                <w:sz w:val="18"/>
-                <w:szCs w:val="18"/>
-                <w:vertAlign w:val="superscript"/>
-              </w:rPr>
-              <w:t xml:space="preserve">(фамилия, имя отчество (если таковое имеется), </w:t>
-            </w:r>
-          </w:p>
-          <w:p>
-            <w:pPr>
-              <w:ind w:left="-109"/>
+              <w:spacing w:line="280" w:lineRule="exact"/>
               <w:jc w:val="center"/>
               <w:rPr>
                 <w:i/>
@@ -402,12 +290,22 @@
               </w:rPr>
               <w:t>_2</w:t>
             </w:r>
+            <w:r>
+              <w:rPr>
+                <w:rFonts w:ascii="Times New Roman" w:hAnsi="Times New Roman"/>
+                <w:i/>
+                <w:sz w:val="28"/>
+                <w:szCs w:val="28"/>
+              </w:rPr>
+              <w:t>,</w:t>
+            </w:r>
           </w:p>
         </w:tc>
       </w:tr>
       <w:tr>
         <w:trPr>
-          <w:trHeight w:val="308"/>
+          <w:trHeight w:val="421"/>
+          <w:jc w:val="center"/>
         </w:trPr>
         <w:tc>
           <w:tcPr>
@@ -419,11 +317,12 @@
           </w:tcPr>
           <w:p>
             <w:pPr>
+              <w:spacing w:line="280" w:lineRule="exact"/>
               <w:jc w:val="both"/>
               <w:rPr>
                 <w:rFonts w:ascii="Times New Roman" w:hAnsi="Times New Roman"/>
-                <w:sz w:val="24"/>
-                <w:szCs w:val="24"/>
+                <w:sz w:val="28"/>
+                <w:szCs w:val="28"/>
               </w:rPr>
             </w:pPr>
           </w:p>
@@ -436,46 +335,16 @@
               <w:left w:val="nil"/>
               <w:bottom w:val="single" w:sz="4" w:space="0" w:color="auto"/>
             </w:tcBorders>
+            <w:vAlign w:val="bottom"/>
           </w:tcPr>
           <w:p>
             <w:pPr>
-              <w:ind w:left="-109"/>
-              <w:jc w:val="center"/>
-              <w:rPr>
-                <w:rFonts w:ascii="Times New Roman" w:hAnsi="Times New Roman"/>
-                <w:sz w:val="18"/>
-                <w:szCs w:val="18"/>
-                <w:vertAlign w:val="superscript"/>
-              </w:rPr>
-            </w:pPr>
-            <w:r>
-              <w:rPr>
-                <w:rFonts w:ascii="Times New Roman" w:hAnsi="Times New Roman"/>
-                <w:sz w:val="18"/>
-                <w:szCs w:val="18"/>
-                <w:vertAlign w:val="superscript"/>
-              </w:rPr>
-              <w:t>дата рождения,</w:t>
-            </w:r>
-            <w:r>
-              <w:rPr>
-                <w:rFonts w:ascii="Times New Roman" w:hAnsi="Times New Roman"/>
-                <w:sz w:val="18"/>
-                <w:szCs w:val="18"/>
-                <w:vertAlign w:val="superscript"/>
-              </w:rPr>
-              <w:t xml:space="preserve"> </w:t>
-            </w:r>
-          </w:p>
-          <w:p>
-            <w:pPr>
-              <w:ind w:left="-109"/>
+              <w:spacing w:line="280" w:lineRule="exact"/>
               <w:jc w:val="center"/>
               <w:rPr>
                 <w:rFonts w:ascii="Times New Roman" w:hAnsi="Times New Roman"/>
                 <w:sz w:val="28"/>
-                <w:szCs w:val="24"/>
-                <w:vertAlign w:val="superscript"/>
+                <w:szCs w:val="28"/>
               </w:rPr>
             </w:pPr>
             <w:r>
@@ -502,7 +371,8 @@
       </w:tr>
       <w:tr>
         <w:trPr>
-          <w:trHeight w:val="510"/>
+          <w:trHeight w:val="144"/>
+          <w:jc w:val="center"/>
         </w:trPr>
         <w:tc>
           <w:tcPr>
@@ -514,11 +384,12 @@
           </w:tcPr>
           <w:p>
             <w:pPr>
+              <w:spacing w:line="280" w:lineRule="exact"/>
               <w:jc w:val="both"/>
               <w:rPr>
                 <w:rFonts w:ascii="Times New Roman" w:hAnsi="Times New Roman"/>
-                <w:sz w:val="24"/>
-                <w:szCs w:val="24"/>
+                <w:sz w:val="28"/>
+                <w:szCs w:val="28"/>
               </w:rPr>
             </w:pPr>
           </w:p>
@@ -534,24 +405,14 @@
           </w:tcPr>
           <w:p>
             <w:pPr>
-              <w:ind w:left="-109"/>
+              <w:spacing w:line="280" w:lineRule="exact"/>
               <w:jc w:val="center"/>
               <w:rPr>
                 <w:rFonts w:ascii="Times New Roman" w:hAnsi="Times New Roman"/>
-                <w:sz w:val="18"/>
-                <w:szCs w:val="18"/>
-                <w:vertAlign w:val="superscript"/>
+                <w:sz w:val="28"/>
+                <w:szCs w:val="28"/>
               </w:rPr>
             </w:pPr>
-            <w:r>
-              <w:rPr>
-                <w:rFonts w:ascii="Times New Roman" w:hAnsi="Times New Roman"/>
-                <w:sz w:val="18"/>
-                <w:szCs w:val="18"/>
-                <w:vertAlign w:val="superscript"/>
-              </w:rPr>
-              <w:t>идентификационный номер)</w:t>
-            </w:r>
           </w:p>
         </w:tc>
       </w:tr>
@@ -559,13 +420,26 @@
     <w:p>
       <w:pPr>
         <w:pStyle w:val="newncpi"/>
+        <w:rPr>
+          <w:sz w:val="28"/>
+          <w:szCs w:val="28"/>
+        </w:rPr>
       </w:pPr>
     </w:p>
     <w:p>
       <w:pPr>
         <w:pStyle w:val="newncpi"/>
-      </w:pPr>
-      <w:r>
+        <w:ind w:firstLine="709"/>
+        <w:rPr>
+          <w:sz w:val="28"/>
+          <w:szCs w:val="28"/>
+        </w:rPr>
+      </w:pPr>
+      <w:r>
+        <w:rPr>
+          <w:sz w:val="28"/>
+          <w:szCs w:val="28"/>
+        </w:rPr>
         <w:t xml:space="preserve">Прошу выдать пропуск(а) для въезда, пребывания на территориях зоны эвакуации (отчуждения), зоны первоочередного отселения и зоны последующего отселения, с которых отселено население и на которых установлен контрольно-пропускной режим, в </w:t>
       </w:r>
       <w:r>
@@ -573,6 +447,8 @@
           <w:b/>
           <w:bCs/>
           <w:i/>
+          <w:sz w:val="28"/>
+          <w:szCs w:val="28"/>
           <w:lang w:val="en-US"/>
         </w:rPr>
         <w:t>Placeholder</w:t>
@@ -582,35 +458,75 @@
           <w:b/>
           <w:bCs/>
           <w:i/>
+          <w:sz w:val="28"/>
+          <w:szCs w:val="28"/>
         </w:rPr>
         <w:t>_4</w:t>
       </w:r>
       <w:r>
         <w:rPr>
           <w:i/>
+          <w:sz w:val="28"/>
+          <w:szCs w:val="28"/>
         </w:rPr>
         <w:t xml:space="preserve"> </w:t>
       </w:r>
       <w:r>
+        <w:rPr>
+          <w:sz w:val="28"/>
+          <w:szCs w:val="28"/>
+        </w:rPr>
         <w:t>районе(ах) Гомельской области</w:t>
       </w:r>
       <w:r>
+        <w:rPr>
+          <w:sz w:val="28"/>
+          <w:szCs w:val="28"/>
+        </w:rPr>
         <w:t>,</w:t>
       </w:r>
       <w:r>
+        <w:rPr>
+          <w:sz w:val="28"/>
+          <w:szCs w:val="28"/>
+        </w:rPr>
         <w:t xml:space="preserve"> </w:t>
       </w:r>
       <w:r>
+        <w:rPr>
+          <w:sz w:val="28"/>
+          <w:szCs w:val="28"/>
+        </w:rPr>
         <w:t>на следующем(их) о</w:t>
       </w:r>
       <w:r>
-        <w:t xml:space="preserve">бъекте(ах) </w:t>
+        <w:rPr>
+          <w:sz w:val="28"/>
+          <w:szCs w:val="28"/>
+        </w:rPr>
+        <w:t>бъекте(ах)</w:t>
+      </w:r>
+      <w:r>
+        <w:rPr>
+          <w:sz w:val="28"/>
+          <w:szCs w:val="28"/>
+        </w:rPr>
+        <w:t>:</w:t>
+      </w:r>
+      <w:r>
+        <w:rPr>
+          <w:sz w:val="28"/>
+          <w:szCs w:val="28"/>
+        </w:rPr>
+        <w:t xml:space="preserve"> </w:t>
       </w:r>
       <w:r>
         <w:rPr>
           <w:b/>
           <w:bCs/>
           <w:i/>
+          <w:sz w:val="28"/>
+          <w:szCs w:val="28"/>
           <w:lang w:val="en-US"/>
         </w:rPr>
         <w:t>Placeholder</w:t>
@@ -620,6 +536,8 @@
           <w:b/>
           <w:bCs/>
           <w:i/>
+          <w:sz w:val="28"/>
+          <w:szCs w:val="28"/>
         </w:rPr>
         <w:t>_</w:t>
       </w:r>
@@ -628,22 +546,45 @@
           <w:b/>
           <w:bCs/>
           <w:i/>
+          <w:sz w:val="28"/>
+          <w:szCs w:val="28"/>
         </w:rPr>
         <w:t>5</w:t>
       </w:r>
       <w:r>
         <w:rPr>
-          <w:vertAlign w:val="superscript"/>
+          <w:i/>
+          <w:sz w:val="28"/>
+          <w:szCs w:val="28"/>
+        </w:rPr>
+        <w:t>,</w:t>
+      </w:r>
+      <w:r>
+        <w:rPr>
+          <w:sz w:val="28"/>
+          <w:szCs w:val="28"/>
         </w:rPr>
         <w:t xml:space="preserve"> </w:t>
       </w:r>
       <w:r>
+        <w:rPr>
+          <w:sz w:val="28"/>
+          <w:szCs w:val="28"/>
+        </w:rPr>
         <w:t>с целью</w:t>
       </w:r>
       <w:r>
+        <w:rPr>
+          <w:sz w:val="28"/>
+          <w:szCs w:val="28"/>
+        </w:rPr>
         <w:t>:</w:t>
       </w:r>
       <w:r>
+        <w:rPr>
+          <w:sz w:val="28"/>
+          <w:szCs w:val="28"/>
+        </w:rPr>
         <w:t xml:space="preserve"> </w:t>
       </w:r>
       <w:r>
@@ -651,6 +592,8 @@
           <w:b/>
           <w:bCs/>
           <w:i/>
+          <w:sz w:val="28"/>
+          <w:szCs w:val="28"/>
           <w:lang w:val="en-US"/>
         </w:rPr>
         <w:t>Placeholder</w:t>
@@ -660,29 +603,49 @@
           <w:b/>
           <w:bCs/>
           <w:i/>
+          <w:sz w:val="28"/>
+          <w:szCs w:val="28"/>
         </w:rPr>
         <w:t>_6</w:t>
+      </w:r>
+      <w:r>
+        <w:rPr>
+          <w:i/>
+          <w:sz w:val="28"/>
+          <w:szCs w:val="28"/>
+        </w:rPr>
+        <w:t>,</w:t>
       </w:r>
       <w:r>
         <w:rPr>
           <w:b/>
           <w:bCs/>
           <w:i/>
+          <w:sz w:val="28"/>
+          <w:szCs w:val="28"/>
         </w:rPr>
         <w:t xml:space="preserve"> </w:t>
       </w:r>
       <w:r>
+        <w:rPr>
+          <w:sz w:val="28"/>
+          <w:szCs w:val="28"/>
+        </w:rPr>
         <w:t xml:space="preserve">на срок </w:t>
       </w:r>
       <w:r>
         <w:rPr>
           <w:i/>
+          <w:sz w:val="28"/>
+          <w:szCs w:val="28"/>
         </w:rPr>
         <w:t>с</w:t>
       </w:r>
       <w:r>
         <w:rPr>
           <w:i/>
+          <w:sz w:val="28"/>
+          <w:szCs w:val="28"/>
         </w:rPr>
         <w:t xml:space="preserve"> </w:t>
       </w:r>
@@ -691,6 +654,8 @@
           <w:b/>
           <w:bCs/>
           <w:i/>
+          <w:sz w:val="28"/>
+          <w:szCs w:val="28"/>
           <w:lang w:val="en-US"/>
         </w:rPr>
         <w:t>Placeholder</w:t>
@@ -700,20 +665,34 @@
           <w:b/>
           <w:bCs/>
           <w:i/>
+          <w:sz w:val="28"/>
+          <w:szCs w:val="28"/>
         </w:rPr>
         <w:t>_7</w:t>
       </w:r>
       <w:r>
         <w:rPr>
           <w:i/>
-        </w:rPr>
-        <w:t xml:space="preserve"> по </w:t>
+          <w:sz w:val="28"/>
+          <w:szCs w:val="28"/>
+        </w:rPr>
+        <w:t xml:space="preserve"> по</w:t>
+      </w:r>
+      <w:r>
+        <w:rPr>
+          <w:i/>
+          <w:sz w:val="28"/>
+          <w:szCs w:val="28"/>
+        </w:rPr>
+        <w:t xml:space="preserve"> </w:t>
       </w:r>
       <w:r>
         <w:rPr>
           <w:b/>
           <w:bCs/>
           <w:i/>
+          <w:sz w:val="28"/>
+          <w:szCs w:val="28"/>
           <w:lang w:val="en-US"/>
         </w:rPr>
         <w:t>Placeholder</w:t>
@@ -723,22 +702,46 @@
           <w:b/>
           <w:bCs/>
           <w:i/>
+          <w:sz w:val="28"/>
+          <w:szCs w:val="28"/>
         </w:rPr>
         <w:t>_8</w:t>
       </w:r>
       <w:r>
         <w:rPr>
           <w:i/>
+          <w:sz w:val="28"/>
+          <w:szCs w:val="28"/>
+        </w:rPr>
+        <w:t>,</w:t>
+      </w:r>
+      <w:r>
+        <w:rPr>
+          <w:i/>
+          <w:sz w:val="28"/>
+          <w:szCs w:val="28"/>
         </w:rPr>
         <w:t xml:space="preserve"> </w:t>
       </w:r>
       <w:r>
+        <w:rPr>
+          <w:sz w:val="28"/>
+          <w:szCs w:val="28"/>
+        </w:rPr>
         <w:t>для</w:t>
       </w:r>
       <w:r>
+        <w:rPr>
+          <w:sz w:val="28"/>
+          <w:szCs w:val="28"/>
+        </w:rPr>
         <w:t xml:space="preserve"> </w:t>
       </w:r>
       <w:r>
+        <w:rPr>
+          <w:sz w:val="28"/>
+          <w:szCs w:val="28"/>
+        </w:rPr>
         <w:t>меня лично и следующего(их) со мной:</w:t>
       </w:r>
     </w:p>
@@ -749,14 +752,17 @@
           <w:ilvl w:val="0"/>
           <w:numId w:val="4"/>
         </w:numPr>
-        <w:rPr>
-          <w:sz w:val="22"/>
-          <w:szCs w:val="22"/>
-        </w:rPr>
-      </w:pPr>
-      <w:r>
-        <w:rPr>
-          <w:i/>
+        <w:ind w:left="0" w:firstLine="709"/>
+        <w:rPr>
+          <w:sz w:val="28"/>
+          <w:szCs w:val="28"/>
+        </w:rPr>
+      </w:pPr>
+      <w:r>
+        <w:rPr>
+          <w:i/>
+          <w:sz w:val="28"/>
+          <w:szCs w:val="28"/>
           <w:lang w:val="en-US"/>
         </w:rPr>
         <w:t>Placeholder</w:t>
@@ -764,12 +770,16 @@
       <w:r>
         <w:rPr>
           <w:i/>
+          <w:sz w:val="28"/>
+          <w:szCs w:val="28"/>
         </w:rPr>
         <w:t xml:space="preserve">_10.1 </w:t>
       </w:r>
       <w:r>
         <w:rPr>
           <w:i/>
+          <w:sz w:val="28"/>
+          <w:szCs w:val="28"/>
           <w:lang w:val="en-US"/>
         </w:rPr>
         <w:t>Placeholder</w:t>
@@ -777,12 +787,16 @@
       <w:r>
         <w:rPr>
           <w:i/>
+          <w:sz w:val="28"/>
+          <w:szCs w:val="28"/>
         </w:rPr>
         <w:t xml:space="preserve">_10.2 </w:t>
       </w:r>
       <w:r>
         <w:rPr>
           <w:i/>
+          <w:sz w:val="28"/>
+          <w:szCs w:val="28"/>
           <w:lang w:val="en-US"/>
         </w:rPr>
         <w:t>Placeholder</w:t>
@@ -790,12 +804,16 @@
       <w:r>
         <w:rPr>
           <w:i/>
+          <w:sz w:val="28"/>
+          <w:szCs w:val="28"/>
         </w:rPr>
         <w:t>_</w:t>
       </w:r>
       <w:r>
         <w:rPr>
           <w:i/>
+          <w:sz w:val="28"/>
+          <w:szCs w:val="28"/>
           <w:lang w:val="en-US"/>
         </w:rPr>
         <w:t>10</w:t>
@@ -803,12 +821,16 @@
       <w:r>
         <w:rPr>
           <w:i/>
+          <w:sz w:val="28"/>
+          <w:szCs w:val="28"/>
         </w:rPr>
         <w:t xml:space="preserve">.3, </w:t>
       </w:r>
       <w:r>
         <w:rPr>
           <w:i/>
+          <w:sz w:val="28"/>
+          <w:szCs w:val="28"/>
           <w:lang w:val="en-US"/>
         </w:rPr>
         <w:t>Placeholder</w:t>
@@ -816,6 +838,8 @@
       <w:r>
         <w:rPr>
           <w:i/>
+          <w:sz w:val="28"/>
+          <w:szCs w:val="28"/>
         </w:rPr>
         <w:t>_11</w:t>
       </w:r>
@@ -823,23 +847,34 @@
     <w:p>
       <w:pPr>
         <w:pStyle w:val="newncpi"/>
-        <w:ind w:left="927" w:firstLine="0"/>
+        <w:ind w:left="927" w:firstLine="709"/>
+        <w:rPr>
+          <w:sz w:val="28"/>
+          <w:szCs w:val="28"/>
+        </w:rPr>
       </w:pPr>
     </w:p>
     <w:p>
       <w:pPr>
         <w:pStyle w:val="newncpi"/>
-        <w:ind w:left="927" w:firstLine="0"/>
-      </w:pPr>
-    </w:p>
-    <w:p>
-      <w:pPr>
-        <w:pStyle w:val="newncpi"/>
-      </w:pPr>
-      <w:r>
+        <w:ind w:firstLine="709"/>
+        <w:rPr>
+          <w:sz w:val="28"/>
+          <w:szCs w:val="28"/>
+        </w:rPr>
+      </w:pPr>
+      <w:r>
+        <w:rPr>
+          <w:sz w:val="28"/>
+          <w:szCs w:val="28"/>
+        </w:rPr>
         <w:t>Въезд на территорию будет осуществляться на автомобиле</w:t>
       </w:r>
       <w:r>
+        <w:rPr>
+          <w:sz w:val="28"/>
+          <w:szCs w:val="28"/>
+        </w:rPr>
         <w:t>:</w:t>
       </w:r>
     </w:p>
@@ -850,320 +885,301 @@
           <w:ilvl w:val="0"/>
           <w:numId w:val="5"/>
         </w:numPr>
-        <w:ind w:left="0" w:firstLine="567"/>
+        <w:ind w:left="0" w:firstLine="709"/>
         <w:rPr>
           <w:i/>
           <w:iCs/>
+          <w:sz w:val="28"/>
+          <w:szCs w:val="28"/>
         </w:rPr>
       </w:pPr>
       <w:r>
         <w:rPr>
           <w:i/>
           <w:iCs/>
-        </w:rPr>
-        <w:t>Placeholder_12</w:t>
-      </w:r>
-      <w:r>
-        <w:rPr>
-          <w:i/>
-          <w:iCs/>
-        </w:rPr>
-        <w:t>,</w:t>
-      </w:r>
-      <w:r>
-        <w:rPr>
-          <w:i/>
-          <w:iCs/>
-        </w:rPr>
-        <w:t xml:space="preserve"> </w:t>
-      </w:r>
-      <w:r>
-        <w:rPr>
-          <w:i/>
-          <w:iCs/>
-        </w:rPr>
-        <w:t>Placeholder_13</w:t>
+          <w:sz w:val="28"/>
+          <w:szCs w:val="28"/>
+        </w:rPr>
+        <w:t>Placeholder_12, Placeholder_13</w:t>
       </w:r>
     </w:p>
     <w:p>
       <w:pPr>
         <w:pStyle w:val="newncpi"/>
         <w:ind w:left="927" w:firstLine="0"/>
+        <w:rPr>
+          <w:sz w:val="28"/>
+          <w:szCs w:val="28"/>
+        </w:rPr>
       </w:pPr>
     </w:p>
     <w:p>
       <w:pPr>
         <w:rPr>
           <w:rFonts w:ascii="Times New Roman" w:hAnsi="Times New Roman"/>
-          <w:sz w:val="24"/>
-          <w:szCs w:val="24"/>
+          <w:sz w:val="28"/>
+          <w:szCs w:val="28"/>
         </w:rPr>
       </w:pPr>
       <w:r>
         <w:rPr>
           <w:rFonts w:ascii="Times New Roman" w:hAnsi="Times New Roman"/>
-          <w:sz w:val="24"/>
-          <w:szCs w:val="24"/>
-        </w:rPr>
-        <w:t>Письменного ответа не требуется.</w:t>
+          <w:i/>
+          <w:sz w:val="28"/>
+          <w:szCs w:val="28"/>
+          <w:lang w:val="en-US"/>
+        </w:rPr>
+        <w:t>Placeholder</w:t>
+      </w:r>
+      <w:r>
+        <w:rPr>
+          <w:rFonts w:ascii="Times New Roman" w:hAnsi="Times New Roman"/>
+          <w:i/>
+          <w:sz w:val="28"/>
+          <w:szCs w:val="28"/>
+        </w:rPr>
+        <w:t>_9</w:t>
+      </w:r>
+      <w:r>
+        <w:rPr>
+          <w:rFonts w:ascii="Times New Roman" w:hAnsi="Times New Roman"/>
+          <w:sz w:val="28"/>
+          <w:szCs w:val="28"/>
+        </w:rPr>
+        <w:tab/>
+        <w:t xml:space="preserve">           </w:t>
+      </w:r>
+      <w:r>
+        <w:rPr>
+          <w:rFonts w:ascii="Times New Roman" w:hAnsi="Times New Roman"/>
+          <w:sz w:val="28"/>
+          <w:szCs w:val="28"/>
+        </w:rPr>
+        <w:t xml:space="preserve">                                                             </w:t>
+      </w:r>
+      <w:r>
+        <w:rPr>
+          <w:rFonts w:ascii="Times New Roman" w:hAnsi="Times New Roman"/>
+          <w:sz w:val="28"/>
+          <w:szCs w:val="28"/>
+        </w:rPr>
+        <w:t xml:space="preserve">         </w:t>
+      </w:r>
+      <w:r>
+        <w:rPr>
+          <w:rFonts w:ascii="Times New Roman" w:hAnsi="Times New Roman"/>
+          <w:sz w:val="28"/>
+          <w:szCs w:val="28"/>
+        </w:rPr>
+        <w:t xml:space="preserve">   </w:t>
+      </w:r>
+      <w:r>
+        <w:rPr>
+          <w:rFonts w:ascii="Times New Roman" w:hAnsi="Times New Roman"/>
+          <w:sz w:val="28"/>
+          <w:szCs w:val="28"/>
+        </w:rPr>
+        <w:t xml:space="preserve"> </w:t>
+      </w:r>
+      <w:r>
+        <w:rPr>
+          <w:rFonts w:ascii="Times New Roman" w:hAnsi="Times New Roman"/>
+          <w:sz w:val="28"/>
+          <w:szCs w:val="28"/>
+        </w:rPr>
+        <w:t>___________</w:t>
+      </w:r>
+      <w:r>
+        <w:rPr>
+          <w:rFonts w:ascii="Times New Roman" w:hAnsi="Times New Roman"/>
+          <w:sz w:val="28"/>
+          <w:szCs w:val="28"/>
+        </w:rPr>
+        <w:t xml:space="preserve"> </w:t>
       </w:r>
     </w:p>
     <w:p>
       <w:pPr>
         <w:rPr>
           <w:rFonts w:ascii="Times New Roman" w:hAnsi="Times New Roman"/>
-          <w:sz w:val="24"/>
-          <w:szCs w:val="24"/>
+          <w:sz w:val="28"/>
+          <w:szCs w:val="28"/>
+          <w:vertAlign w:val="superscript"/>
         </w:rPr>
       </w:pPr>
       <w:r>
         <w:rPr>
           <w:rFonts w:ascii="Times New Roman" w:hAnsi="Times New Roman"/>
-          <w:sz w:val="24"/>
-          <w:szCs w:val="24"/>
-        </w:rPr>
-        <w:t>С мерами радиационной и пожарной безопасности ознакомлен(а).</w:t>
+          <w:sz w:val="28"/>
+          <w:szCs w:val="28"/>
+          <w:vertAlign w:val="superscript"/>
+        </w:rPr>
+        <w:t xml:space="preserve">                                                                                                                                                                                              </w:t>
+      </w:r>
+      <w:r>
+        <w:rPr>
+          <w:rFonts w:ascii="Times New Roman" w:hAnsi="Times New Roman"/>
+          <w:sz w:val="28"/>
+          <w:szCs w:val="28"/>
+          <w:vertAlign w:val="superscript"/>
+        </w:rPr>
+        <w:t>(подпись)</w:t>
       </w:r>
     </w:p>
     <w:p>
       <w:pPr>
-        <w:pStyle w:val="aa"/>
-        <w:jc w:val="both"/>
-        <w:rPr>
-          <w:sz w:val="24"/>
-          <w:szCs w:val="24"/>
-        </w:rPr>
-      </w:pPr>
-      <w:r>
-        <w:rPr>
-          <w:sz w:val="24"/>
-          <w:szCs w:val="24"/>
-        </w:rPr>
-        <w:t xml:space="preserve">С правилами въезда (входа) в пограничную зону (полосу), </w:t>
-      </w:r>
-      <w:r>
-        <w:rPr>
-          <w:sz w:val="24"/>
-          <w:szCs w:val="24"/>
-        </w:rPr>
-        <w:t xml:space="preserve">порядком </w:t>
-      </w:r>
-      <w:r>
-        <w:rPr>
-          <w:sz w:val="24"/>
-          <w:szCs w:val="24"/>
-        </w:rPr>
-        <w:t xml:space="preserve">пребывания и передвижения в ней ознакомлен(а). </w:t>
-      </w:r>
+        <w:ind w:firstLine="567"/>
+        <w:rPr>
+          <w:rFonts w:ascii="Times New Roman" w:hAnsi="Times New Roman"/>
+          <w:sz w:val="28"/>
+          <w:szCs w:val="28"/>
+        </w:rPr>
+      </w:pPr>
     </w:p>
     <w:p>
       <w:pPr>
+        <w:ind w:firstLine="567"/>
         <w:rPr>
           <w:rFonts w:ascii="Times New Roman" w:hAnsi="Times New Roman"/>
-          <w:sz w:val="24"/>
-          <w:szCs w:val="24"/>
+          <w:sz w:val="28"/>
+          <w:szCs w:val="28"/>
         </w:rPr>
       </w:pPr>
     </w:p>
     <w:p>
       <w:pPr>
+        <w:ind w:firstLine="567"/>
         <w:rPr>
           <w:rFonts w:ascii="Times New Roman" w:hAnsi="Times New Roman"/>
-          <w:sz w:val="24"/>
-          <w:szCs w:val="24"/>
+          <w:sz w:val="28"/>
+          <w:szCs w:val="28"/>
         </w:rPr>
       </w:pPr>
       <w:r>
         <w:rPr>
           <w:rFonts w:ascii="Times New Roman" w:hAnsi="Times New Roman"/>
-          <w:i/>
-          <w:sz w:val="28"/>
-          <w:szCs w:val="28"/>
-          <w:lang w:val="en-US"/>
-        </w:rPr>
-        <w:t>Placeholder</w:t>
+          <w:sz w:val="28"/>
+          <w:szCs w:val="28"/>
+        </w:rPr>
+        <w:t>С мерами радиационной и пожарной безопасности ознакомлен(а)</w:t>
       </w:r>
       <w:r>
         <w:rPr>
           <w:rFonts w:ascii="Times New Roman" w:hAnsi="Times New Roman"/>
-          <w:i/>
-          <w:sz w:val="28"/>
-          <w:szCs w:val="28"/>
-        </w:rPr>
-        <w:t xml:space="preserve">_9  </w:t>
+          <w:sz w:val="28"/>
+          <w:szCs w:val="28"/>
+        </w:rPr>
+        <w:t xml:space="preserve"> _______.</w:t>
       </w:r>
       <w:r>
         <w:rPr>
           <w:rFonts w:ascii="Times New Roman" w:hAnsi="Times New Roman"/>
-          <w:sz w:val="24"/>
-          <w:szCs w:val="24"/>
-        </w:rPr>
-        <w:tab/>
-      </w:r>
-      <w:r>
-        <w:rPr>
-          <w:rFonts w:ascii="Times New Roman" w:hAnsi="Times New Roman"/>
-          <w:sz w:val="24"/>
-          <w:szCs w:val="24"/>
-        </w:rPr>
-        <w:tab/>
-      </w:r>
-      <w:r>
-        <w:rPr>
-          <w:rFonts w:ascii="Times New Roman" w:hAnsi="Times New Roman"/>
-          <w:sz w:val="24"/>
-          <w:szCs w:val="24"/>
-        </w:rPr>
-        <w:t xml:space="preserve">           </w:t>
-      </w:r>
-      <w:r>
-        <w:rPr>
-          <w:rFonts w:ascii="Times New Roman" w:hAnsi="Times New Roman"/>
-          <w:sz w:val="24"/>
-          <w:szCs w:val="24"/>
-        </w:rPr>
-        <w:t xml:space="preserve">Подпись </w:t>
-      </w:r>
-      <w:r>
-        <w:rPr>
-          <w:rFonts w:ascii="Times New Roman" w:hAnsi="Times New Roman"/>
-          <w:sz w:val="24"/>
-          <w:szCs w:val="24"/>
-        </w:rPr>
-        <w:t>___________________________________</w:t>
+          <w:sz w:val="28"/>
+          <w:szCs w:val="28"/>
+        </w:rPr>
+        <w:t xml:space="preserve"> </w:t>
       </w:r>
     </w:p>
     <w:p>
       <w:pPr>
         <w:rPr>
           <w:rFonts w:ascii="Times New Roman" w:hAnsi="Times New Roman"/>
-          <w:sz w:val="24"/>
-          <w:szCs w:val="24"/>
-        </w:rPr>
-      </w:pPr>
+          <w:sz w:val="28"/>
+          <w:szCs w:val="28"/>
+          <w:vertAlign w:val="superscript"/>
+        </w:rPr>
+      </w:pPr>
+      <w:r>
+        <w:rPr>
+          <w:rFonts w:ascii="Times New Roman" w:hAnsi="Times New Roman"/>
+          <w:sz w:val="28"/>
+          <w:szCs w:val="28"/>
+          <w:vertAlign w:val="superscript"/>
+        </w:rPr>
+        <w:t xml:space="preserve">                                                                                                                                                                                                </w:t>
+      </w:r>
+      <w:r>
+        <w:rPr>
+          <w:rFonts w:ascii="Times New Roman" w:hAnsi="Times New Roman"/>
+          <w:sz w:val="28"/>
+          <w:szCs w:val="28"/>
+          <w:vertAlign w:val="superscript"/>
+        </w:rPr>
+        <w:t>(подпись)</w:t>
+      </w:r>
     </w:p>
     <w:p>
       <w:pPr>
+        <w:ind w:firstLine="567"/>
+        <w:jc w:val="both"/>
         <w:rPr>
           <w:rFonts w:ascii="Times New Roman" w:hAnsi="Times New Roman"/>
-          <w:sz w:val="24"/>
-          <w:szCs w:val="24"/>
-        </w:rPr>
-      </w:pPr>
+          <w:sz w:val="28"/>
+          <w:szCs w:val="28"/>
+        </w:rPr>
+      </w:pPr>
+      <w:r>
+        <w:rPr>
+          <w:sz w:val="28"/>
+          <w:szCs w:val="28"/>
+        </w:rPr>
+        <w:t>С правилами въезда (входа) в пограничную зону (полосу), порядком пребывания и передвижения в ней ознакомлен(а)</w:t>
+      </w:r>
+      <w:r>
+        <w:rPr>
+          <w:sz w:val="28"/>
+          <w:szCs w:val="28"/>
+        </w:rPr>
+        <w:t xml:space="preserve"> </w:t>
+      </w:r>
+      <w:r>
+        <w:rPr>
+          <w:rFonts w:ascii="Times New Roman" w:hAnsi="Times New Roman"/>
+          <w:sz w:val="28"/>
+          <w:szCs w:val="28"/>
+        </w:rPr>
+        <w:t>___________.</w:t>
+      </w:r>
+      <w:r>
+        <w:rPr>
+          <w:rFonts w:ascii="Times New Roman" w:hAnsi="Times New Roman"/>
+          <w:sz w:val="28"/>
+          <w:szCs w:val="28"/>
+        </w:rPr>
+        <w:t xml:space="preserve"> </w:t>
+      </w:r>
     </w:p>
     <w:p>
       <w:pPr>
         <w:rPr>
           <w:rFonts w:ascii="Times New Roman" w:hAnsi="Times New Roman"/>
-          <w:sz w:val="24"/>
-          <w:szCs w:val="24"/>
+          <w:sz w:val="28"/>
+          <w:szCs w:val="28"/>
+          <w:vertAlign w:val="superscript"/>
         </w:rPr>
       </w:pPr>
       <w:r>
         <w:rPr>
           <w:rFonts w:ascii="Times New Roman" w:hAnsi="Times New Roman"/>
-          <w:sz w:val="24"/>
-          <w:szCs w:val="24"/>
-        </w:rPr>
-        <w:t>Пропуск</w:t>
+          <w:sz w:val="28"/>
+          <w:szCs w:val="28"/>
+          <w:vertAlign w:val="superscript"/>
+        </w:rPr>
+        <w:t xml:space="preserve">                                                                                                                                               </w:t>
       </w:r>
       <w:r>
         <w:rPr>
           <w:rFonts w:ascii="Times New Roman" w:hAnsi="Times New Roman"/>
-          <w:sz w:val="24"/>
-          <w:szCs w:val="24"/>
-        </w:rPr>
-        <w:t>(а)</w:t>
-      </w:r>
-      <w:r>
-        <w:rPr>
-          <w:rFonts w:ascii="Times New Roman" w:hAnsi="Times New Roman"/>
-          <w:sz w:val="24"/>
-          <w:szCs w:val="24"/>
-        </w:rPr>
-        <w:t xml:space="preserve"> </w:t>
-      </w:r>
-      <w:r>
-        <w:rPr>
-          <w:rFonts w:ascii="Times New Roman" w:hAnsi="Times New Roman"/>
-          <w:bCs/>
-          <w:sz w:val="28"/>
-          <w:szCs w:val="28"/>
-        </w:rPr>
-        <w:t>№</w:t>
-      </w:r>
-      <w:r>
-        <w:rPr>
-          <w:rFonts w:ascii="Times New Roman" w:hAnsi="Times New Roman"/>
-          <w:b/>
-          <w:sz w:val="28"/>
-          <w:szCs w:val="28"/>
-        </w:rPr>
-        <w:t xml:space="preserve"> </w:t>
-      </w:r>
-      <w:r>
-        <w:rPr>
-          <w:rFonts w:ascii="Times New Roman" w:hAnsi="Times New Roman"/>
-          <w:b/>
-          <w:sz w:val="28"/>
-          <w:szCs w:val="28"/>
-        </w:rPr>
-        <w:t>____________</w:t>
-      </w:r>
-      <w:r>
-        <w:rPr>
-          <w:rFonts w:ascii="Times New Roman" w:hAnsi="Times New Roman"/>
-          <w:sz w:val="24"/>
-          <w:szCs w:val="24"/>
-        </w:rPr>
-        <w:tab/>
-      </w:r>
-      <w:r>
-        <w:rPr>
-          <w:rFonts w:ascii="Times New Roman" w:hAnsi="Times New Roman"/>
-          <w:sz w:val="24"/>
-          <w:szCs w:val="24"/>
-        </w:rPr>
-        <w:t>получил ___________________________________</w:t>
-      </w:r>
-    </w:p>
-    <w:p>
-      <w:pPr>
-        <w:rPr>
-          <w:rFonts w:ascii="Times New Roman" w:hAnsi="Times New Roman"/>
-          <w:sz w:val="24"/>
-          <w:szCs w:val="24"/>
+          <w:sz w:val="28"/>
+          <w:szCs w:val="28"/>
           <w:vertAlign w:val="superscript"/>
         </w:rPr>
-      </w:pPr>
-      <w:r>
-        <w:rPr>
-          <w:rFonts w:ascii="Times New Roman" w:hAnsi="Times New Roman"/>
-          <w:sz w:val="24"/>
-          <w:szCs w:val="24"/>
-        </w:rPr>
-        <w:t xml:space="preserve">                                                              </w:t>
-      </w:r>
-      <w:r>
-        <w:rPr>
-          <w:rFonts w:ascii="Times New Roman" w:hAnsi="Times New Roman"/>
-          <w:sz w:val="24"/>
-          <w:szCs w:val="24"/>
-        </w:rPr>
-        <w:t xml:space="preserve">                             </w:t>
-      </w:r>
-      <w:r>
-        <w:rPr>
-          <w:rFonts w:ascii="Times New Roman" w:hAnsi="Times New Roman"/>
-          <w:sz w:val="24"/>
-          <w:szCs w:val="24"/>
-          <w:vertAlign w:val="superscript"/>
-        </w:rPr>
-        <w:t>(подпись,  расшифровка подписи)</w:t>
+        <w:t>(подпись)</w:t>
       </w:r>
     </w:p>
     <w:sectPr>
       <w:headerReference w:type="default" r:id="rId8"/>
+      <w:footerReference w:type="default" r:id="rId9"/>
       <w:pgSz w:w="11906" w:h="16838"/>
       <w:pgMar w:top="1134" w:right="567" w:bottom="1134" w:left="1701" w:header="709" w:footer="709" w:gutter="0"/>
       <w:cols w:space="708"/>
@@ -1190,6 +1206,149 @@
     </w:p>
   </w:endnote>
 </w:endnotes>
+</file>
+
+<file path=word/footer1.xml><?xml version="1.0" encoding="utf-8"?>
+<w:ftr xmlns:wpc="http://schemas.microsoft.com/office/word/2010/wordprocessingCanvas" xmlns:cx="http://schemas.microsoft.com/office/drawing/2014/chartex" xmlns:cx1="http://schemas.microsoft.com/office/drawing/2015/9/8/chartex" xmlns:cx2="http://schemas.microsoft.com/office/drawing/2015/10/21/chartex" xmlns:cx3="http://schemas.microsoft.com/office/drawing/2016/5/9/chartex" xmlns:cx4="http://schemas.microsoft.com/office/drawing/2016/5/10/chartex" xmlns:cx5="http://schemas.microsoft.com/office/drawing/2016/5/11/chartex" xmlns:cx6="http://schemas.microsoft.com/office/drawing/2016/5/12/chartex" xmlns:cx7="http://schemas.microsoft.com/office/drawing/2016/5/13/chartex" xmlns:cx8="http://schemas.microsoft.com/office/drawing/2016/5/14/chartex" xmlns:mc="http://schemas.openxmlformats.org/markup-compatibility/2006" xmlns:aink="http://schemas.microsoft.com/office/drawing/2016/ink" xmlns:am3d="http://schemas.microsoft.com/office/drawing/2017/model3d" xmlns:o="urn:schemas-microsoft-com:office:office" xmlns:oel="http://schemas.microsoft.com/office/2019/extlst" xmlns:r="http://schemas.openxmlformats.org/officeDocument/2006/relationships" xmlns:m="http://schemas.openxmlformats.org/officeDocument/2006/math" xmlns:v="urn:schemas-microsoft-com:vml" xmlns:wp14="http://schemas.microsoft.com/office/word/2010/wordprocessingDrawing" xmlns:wp="http://schemas.openxmlformats.org/drawingml/2006/wordprocessingDrawing" xmlns:w10="urn:schemas-microsoft-com:office:word" xmlns:w="http://schemas.openxmlformats.org/wordprocessingml/2006/main" xmlns:w14="http://schemas.microsoft.com/office/word/2010/wordml" xmlns:w15="http://schemas.microsoft.com/office/word/2012/wordml" xmlns:w16cex="http://schemas.microsoft.com/office/word/2018/wordml/cex" xmlns:w16cid="http://schemas.microsoft.com/office/word/2016/wordml/cid" xmlns:w16="http://schemas.microsoft.com/office/word/2018/wordml" xmlns:w16sdtdh="http://schemas.microsoft.com/office/word/2020/wordml/sdtdatahash" xmlns:w16se="http://schemas.microsoft.com/office/word/2015/wordml/symex" xmlns:wpg="http://schemas.microsoft.com/office/word/2010/wordprocessingGroup" xmlns:wpi="http://schemas.microsoft.com/office/word/2010/wordprocessingInk" xmlns:wne="http://schemas.microsoft.com/office/word/2006/wordml" xmlns:wps="http://schemas.microsoft.com/office/word/2010/wordprocessingShape" mc:Ignorable="w14 w15 w16se w16cid w16 w16cex w16sdtdh wp14">
+  <w:p>
+    <w:pPr>
+      <w:rPr>
+        <w:rFonts w:ascii="Times New Roman" w:hAnsi="Times New Roman"/>
+        <w:sz w:val="28"/>
+        <w:szCs w:val="28"/>
+      </w:rPr>
+    </w:pPr>
+    <w:r>
+      <w:rPr>
+        <w:rFonts w:ascii="Times New Roman" w:hAnsi="Times New Roman"/>
+        <w:sz w:val="28"/>
+        <w:szCs w:val="28"/>
+      </w:rPr>
+      <w:t xml:space="preserve">Пропуск(а) </w:t>
+    </w:r>
+    <w:r>
+      <w:rPr>
+        <w:rFonts w:ascii="Times New Roman" w:hAnsi="Times New Roman"/>
+        <w:bCs/>
+        <w:sz w:val="28"/>
+        <w:szCs w:val="28"/>
+      </w:rPr>
+      <w:t>№</w:t>
+    </w:r>
+    <w:r>
+      <w:rPr>
+        <w:rFonts w:ascii="Times New Roman" w:hAnsi="Times New Roman"/>
+        <w:b/>
+        <w:sz w:val="28"/>
+        <w:szCs w:val="28"/>
+      </w:rPr>
+      <w:t xml:space="preserve"> </w:t>
+    </w:r>
+    <w:r>
+      <w:rPr>
+        <w:rFonts w:ascii="Times New Roman" w:hAnsi="Times New Roman"/>
+        <w:bCs/>
+        <w:sz w:val="28"/>
+        <w:szCs w:val="28"/>
+      </w:rPr>
+      <w:t>__________</w:t>
+    </w:r>
+    <w:r>
+      <w:rPr>
+        <w:rFonts w:ascii="Times New Roman" w:hAnsi="Times New Roman"/>
+        <w:bCs/>
+        <w:sz w:val="28"/>
+        <w:szCs w:val="28"/>
+      </w:rPr>
+      <w:t>________________________</w:t>
+    </w:r>
+    <w:r>
+      <w:rPr>
+        <w:rFonts w:ascii="Times New Roman" w:hAnsi="Times New Roman"/>
+        <w:bCs/>
+        <w:sz w:val="28"/>
+        <w:szCs w:val="28"/>
+      </w:rPr>
+      <w:t>_</w:t>
+    </w:r>
+    <w:r>
+      <w:rPr>
+        <w:rFonts w:ascii="Times New Roman" w:hAnsi="Times New Roman"/>
+        <w:sz w:val="28"/>
+        <w:szCs w:val="28"/>
+      </w:rPr>
+      <w:t>получил</w:t>
+    </w:r>
+    <w:r>
+      <w:rPr>
+        <w:rFonts w:ascii="Times New Roman" w:hAnsi="Times New Roman"/>
+        <w:sz w:val="28"/>
+        <w:szCs w:val="28"/>
+      </w:rPr>
+      <w:t>(а)</w:t>
+    </w:r>
+    <w:r>
+      <w:rPr>
+        <w:rFonts w:ascii="Times New Roman" w:hAnsi="Times New Roman"/>
+        <w:sz w:val="28"/>
+        <w:szCs w:val="28"/>
+      </w:rPr>
+      <w:t xml:space="preserve"> </w:t>
+    </w:r>
+    <w:r>
+      <w:rPr>
+        <w:rFonts w:ascii="Times New Roman" w:hAnsi="Times New Roman"/>
+        <w:sz w:val="28"/>
+        <w:szCs w:val="28"/>
+      </w:rPr>
+      <w:t>___________</w:t>
+    </w:r>
+    <w:r>
+      <w:rPr>
+        <w:rFonts w:ascii="Times New Roman" w:hAnsi="Times New Roman"/>
+        <w:sz w:val="28"/>
+        <w:szCs w:val="28"/>
+      </w:rPr>
+      <w:t xml:space="preserve"> </w:t>
+    </w:r>
+    <w:r>
+      <w:rPr>
+        <w:rFonts w:ascii="Times New Roman" w:hAnsi="Times New Roman"/>
+        <w:sz w:val="28"/>
+        <w:szCs w:val="28"/>
+      </w:rPr>
+      <w:t xml:space="preserve"> </w:t>
+    </w:r>
+  </w:p>
+  <w:p>
+    <w:pPr>
+      <w:rPr>
+        <w:rFonts w:ascii="Times New Roman" w:hAnsi="Times New Roman"/>
+        <w:sz w:val="28"/>
+        <w:szCs w:val="28"/>
+        <w:vertAlign w:val="superscript"/>
+      </w:rPr>
+    </w:pPr>
+    <w:r>
+      <w:rPr>
+        <w:rFonts w:ascii="Times New Roman" w:hAnsi="Times New Roman"/>
+        <w:sz w:val="28"/>
+        <w:szCs w:val="28"/>
+        <w:vertAlign w:val="superscript"/>
+      </w:rPr>
+      <w:t xml:space="preserve">                                                                                                                                                                                             </w:t>
+    </w:r>
+    <w:r>
+      <w:rPr>
+        <w:rFonts w:ascii="Times New Roman" w:hAnsi="Times New Roman"/>
+        <w:sz w:val="28"/>
+        <w:szCs w:val="28"/>
+        <w:vertAlign w:val="superscript"/>
+      </w:rPr>
+      <w:t>(подпись)</w:t>
+    </w:r>
+  </w:p>
+</w:ftr>
 </file>
 
 <file path=word/footnotes.xml><?xml version="1.0" encoding="utf-8"?>

</xml_diff>

<commit_message>
v0.1.18: updated templates (Заявление 14.3, Заявление 14.5, transport permits)
</commit_message>
<xml_diff>
--- a/templates/Заявление_14.3.docx
+++ b/templates/Заявление_14.3.docx
@@ -143,7 +143,6 @@
               <w:jc w:val="center"/>
               <w:rPr>
                 <w:rFonts w:ascii="Times New Roman" w:hAnsi="Times New Roman"/>
-                <w:i/>
                 <w:sz w:val="28"/>
                 <w:szCs w:val="28"/>
               </w:rPr>
@@ -151,7 +150,6 @@
             <w:r>
               <w:rPr>
                 <w:rFonts w:ascii="Times New Roman" w:hAnsi="Times New Roman"/>
-                <w:i/>
                 <w:sz w:val="28"/>
                 <w:szCs w:val="28"/>
                 <w:lang w:val="en-US"/>
@@ -161,7 +159,6 @@
             <w:r>
               <w:rPr>
                 <w:rFonts w:ascii="Times New Roman" w:hAnsi="Times New Roman"/>
-                <w:i/>
                 <w:sz w:val="28"/>
                 <w:szCs w:val="28"/>
               </w:rPr>
@@ -170,7 +167,6 @@
             <w:r>
               <w:rPr>
                 <w:rFonts w:ascii="Times New Roman" w:hAnsi="Times New Roman"/>
-                <w:i/>
                 <w:sz w:val="28"/>
                 <w:szCs w:val="28"/>
               </w:rPr>
@@ -179,7 +175,6 @@
             <w:r>
               <w:rPr>
                 <w:rFonts w:ascii="Times New Roman" w:hAnsi="Times New Roman"/>
-                <w:i/>
                 <w:sz w:val="28"/>
                 <w:szCs w:val="28"/>
                 <w:lang w:val="en-US"/>
@@ -189,7 +184,6 @@
             <w:r>
               <w:rPr>
                 <w:rFonts w:ascii="Times New Roman" w:hAnsi="Times New Roman"/>
-                <w:i/>
                 <w:sz w:val="28"/>
                 <w:szCs w:val="28"/>
               </w:rPr>
@@ -198,7 +192,6 @@
             <w:r>
               <w:rPr>
                 <w:rFonts w:ascii="Times New Roman" w:hAnsi="Times New Roman"/>
-                <w:i/>
                 <w:sz w:val="28"/>
                 <w:szCs w:val="28"/>
                 <w:lang w:val="en-US"/>
@@ -208,7 +201,6 @@
             <w:r>
               <w:rPr>
                 <w:rFonts w:ascii="Times New Roman" w:hAnsi="Times New Roman"/>
-                <w:i/>
                 <w:sz w:val="28"/>
                 <w:szCs w:val="28"/>
               </w:rPr>
@@ -217,7 +209,6 @@
             <w:r>
               <w:rPr>
                 <w:rFonts w:ascii="Times New Roman" w:hAnsi="Times New Roman"/>
-                <w:i/>
                 <w:sz w:val="28"/>
                 <w:szCs w:val="28"/>
               </w:rPr>
@@ -266,7 +257,6 @@
               <w:spacing w:line="280" w:lineRule="exact"/>
               <w:jc w:val="center"/>
               <w:rPr>
-                <w:i/>
                 <w:sz w:val="28"/>
                 <w:szCs w:val="28"/>
               </w:rPr>
@@ -274,7 +264,6 @@
             <w:r>
               <w:rPr>
                 <w:rFonts w:ascii="Times New Roman" w:hAnsi="Times New Roman"/>
-                <w:i/>
                 <w:sz w:val="28"/>
                 <w:szCs w:val="28"/>
                 <w:lang w:val="en-US"/>
@@ -284,7 +273,6 @@
             <w:r>
               <w:rPr>
                 <w:rFonts w:ascii="Times New Roman" w:hAnsi="Times New Roman"/>
-                <w:i/>
                 <w:sz w:val="28"/>
                 <w:szCs w:val="28"/>
               </w:rPr>
@@ -293,7 +281,6 @@
             <w:r>
               <w:rPr>
                 <w:rFonts w:ascii="Times New Roman" w:hAnsi="Times New Roman"/>
-                <w:i/>
                 <w:sz w:val="28"/>
                 <w:szCs w:val="28"/>
               </w:rPr>
@@ -350,7 +337,6 @@
             <w:r>
               <w:rPr>
                 <w:rFonts w:ascii="Times New Roman" w:hAnsi="Times New Roman"/>
-                <w:i/>
                 <w:sz w:val="28"/>
                 <w:szCs w:val="28"/>
                 <w:lang w:val="en-US"/>
@@ -360,7 +346,6 @@
             <w:r>
               <w:rPr>
                 <w:rFonts w:ascii="Times New Roman" w:hAnsi="Times New Roman"/>
-                <w:i/>
                 <w:sz w:val="28"/>
                 <w:szCs w:val="28"/>
               </w:rPr>
@@ -440,210 +425,234 @@
           <w:sz w:val="28"/>
           <w:szCs w:val="28"/>
         </w:rPr>
-        <w:t xml:space="preserve">Прошу выдать пропуск(а) для въезда, пребывания на территориях зоны эвакуации (отчуждения), зоны первоочередного отселения и зоны последующего отселения, с которых отселено население и на которых установлен контрольно-пропускной режим, в </w:t>
-      </w:r>
-      <w:r>
+        <w:t>Прошу выдать пропуск(а) для въезда, пребывания на территориях зоны эвакуации (отчуждения), зоны первоочередного отселения и зоны последующего отселения, с которых отселено население и на которых установлен контрольно-пропускной режим</w:t>
+      </w:r>
+      <w:r>
+        <w:rPr>
+          <w:sz w:val="28"/>
+          <w:szCs w:val="28"/>
+        </w:rPr>
+        <w:t>, в Гомельской области:</w:t>
+      </w:r>
+    </w:p>
+    <w:p>
+      <w:pPr>
+        <w:pStyle w:val="newncpi"/>
+        <w:ind w:firstLine="709"/>
         <w:rPr>
           <w:b/>
           <w:bCs/>
-          <w:i/>
-          <w:sz w:val="28"/>
-          <w:szCs w:val="28"/>
-          <w:lang w:val="en-US"/>
-        </w:rPr>
-        <w:t>Placeholder</w:t>
+          <w:sz w:val="28"/>
+          <w:szCs w:val="28"/>
+        </w:rPr>
+      </w:pPr>
+      <w:r>
+        <w:rPr>
+          <w:sz w:val="28"/>
+          <w:szCs w:val="28"/>
+        </w:rPr>
+        <w:t xml:space="preserve">район(ы) </w:t>
+      </w:r>
+      <w:r>
+        <w:rPr>
+          <w:sz w:val="28"/>
+          <w:szCs w:val="28"/>
+        </w:rPr>
+        <w:t>для въезда, пребывания</w:t>
+      </w:r>
+      <w:r>
+        <w:rPr>
+          <w:sz w:val="28"/>
+          <w:szCs w:val="28"/>
+        </w:rPr>
+        <w:t xml:space="preserve">: </w:t>
       </w:r>
       <w:r>
         <w:rPr>
           <w:b/>
           <w:bCs/>
-          <w:i/>
-          <w:sz w:val="28"/>
-          <w:szCs w:val="28"/>
-        </w:rPr>
-        <w:t>_4</w:t>
-      </w:r>
-      <w:r>
-        <w:rPr>
-          <w:i/>
-          <w:sz w:val="28"/>
-          <w:szCs w:val="28"/>
-        </w:rPr>
-        <w:t xml:space="preserve"> </w:t>
-      </w:r>
-      <w:r>
-        <w:rPr>
-          <w:sz w:val="28"/>
-          <w:szCs w:val="28"/>
-        </w:rPr>
-        <w:t>районе(ах) Гомельской области</w:t>
-      </w:r>
-      <w:r>
-        <w:rPr>
-          <w:sz w:val="28"/>
-          <w:szCs w:val="28"/>
-        </w:rPr>
-        <w:t>,</w:t>
-      </w:r>
-      <w:r>
-        <w:rPr>
-          <w:sz w:val="28"/>
-          <w:szCs w:val="28"/>
-        </w:rPr>
-        <w:t xml:space="preserve"> </w:t>
-      </w:r>
-      <w:r>
-        <w:rPr>
-          <w:sz w:val="28"/>
-          <w:szCs w:val="28"/>
-        </w:rPr>
-        <w:t>на следующем(их) о</w:t>
-      </w:r>
-      <w:r>
-        <w:rPr>
-          <w:sz w:val="28"/>
-          <w:szCs w:val="28"/>
-        </w:rPr>
-        <w:t>бъекте(ах)</w:t>
-      </w:r>
-      <w:r>
-        <w:rPr>
-          <w:sz w:val="28"/>
-          <w:szCs w:val="28"/>
-        </w:rPr>
-        <w:t>:</w:t>
-      </w:r>
-      <w:r>
-        <w:rPr>
-          <w:sz w:val="28"/>
-          <w:szCs w:val="28"/>
-        </w:rPr>
-        <w:t xml:space="preserve"> </w:t>
+          <w:sz w:val="28"/>
+          <w:szCs w:val="28"/>
+          <w:lang w:val="en-US"/>
+        </w:rPr>
+        <w:t>Placeholder</w:t>
       </w:r>
       <w:r>
         <w:rPr>
           <w:b/>
           <w:bCs/>
-          <w:i/>
-          <w:sz w:val="28"/>
-          <w:szCs w:val="28"/>
-          <w:lang w:val="en-US"/>
-        </w:rPr>
-        <w:t>Placeholder</w:t>
+          <w:sz w:val="28"/>
+          <w:szCs w:val="28"/>
+        </w:rPr>
+        <w:t>_4</w:t>
+      </w:r>
+      <w:r>
+        <w:rPr>
+          <w:sz w:val="28"/>
+          <w:szCs w:val="28"/>
+        </w:rPr>
+        <w:t>;</w:t>
+      </w:r>
+    </w:p>
+    <w:p>
+      <w:pPr>
+        <w:pStyle w:val="newncpi"/>
+        <w:ind w:firstLine="709"/>
+        <w:rPr>
+          <w:sz w:val="28"/>
+          <w:szCs w:val="28"/>
+        </w:rPr>
+      </w:pPr>
+      <w:r>
+        <w:rPr>
+          <w:sz w:val="28"/>
+          <w:szCs w:val="28"/>
+        </w:rPr>
+        <w:t>на следующем(их) объекте(ах)</w:t>
+      </w:r>
+      <w:r>
+        <w:rPr>
+          <w:sz w:val="28"/>
+          <w:szCs w:val="28"/>
+        </w:rPr>
+        <w:t>:</w:t>
+      </w:r>
+      <w:r>
+        <w:rPr>
+          <w:sz w:val="28"/>
+          <w:szCs w:val="28"/>
+        </w:rPr>
+        <w:t xml:space="preserve"> </w:t>
       </w:r>
       <w:r>
         <w:rPr>
           <w:b/>
           <w:bCs/>
-          <w:i/>
-          <w:sz w:val="28"/>
-          <w:szCs w:val="28"/>
-        </w:rPr>
-        <w:t>_</w:t>
+          <w:sz w:val="28"/>
+          <w:szCs w:val="28"/>
+          <w:lang w:val="en-US"/>
+        </w:rPr>
+        <w:t>Placeholder</w:t>
       </w:r>
       <w:r>
         <w:rPr>
           <w:b/>
           <w:bCs/>
-          <w:i/>
-          <w:sz w:val="28"/>
-          <w:szCs w:val="28"/>
-        </w:rPr>
-        <w:t>5</w:t>
-      </w:r>
-      <w:r>
-        <w:rPr>
-          <w:i/>
-          <w:sz w:val="28"/>
-          <w:szCs w:val="28"/>
-        </w:rPr>
-        <w:t>,</w:t>
-      </w:r>
-      <w:r>
-        <w:rPr>
-          <w:sz w:val="28"/>
-          <w:szCs w:val="28"/>
-        </w:rPr>
-        <w:t xml:space="preserve"> </w:t>
-      </w:r>
-      <w:r>
-        <w:rPr>
-          <w:sz w:val="28"/>
-          <w:szCs w:val="28"/>
-        </w:rPr>
-        <w:t>с целью</w:t>
-      </w:r>
-      <w:r>
-        <w:rPr>
-          <w:sz w:val="28"/>
-          <w:szCs w:val="28"/>
-        </w:rPr>
-        <w:t>:</w:t>
-      </w:r>
-      <w:r>
-        <w:rPr>
-          <w:sz w:val="28"/>
-          <w:szCs w:val="28"/>
-        </w:rPr>
-        <w:t xml:space="preserve"> </w:t>
+          <w:sz w:val="28"/>
+          <w:szCs w:val="28"/>
+        </w:rPr>
+        <w:t>_</w:t>
       </w:r>
       <w:r>
         <w:rPr>
           <w:b/>
           <w:bCs/>
-          <w:i/>
-          <w:sz w:val="28"/>
-          <w:szCs w:val="28"/>
-          <w:lang w:val="en-US"/>
-        </w:rPr>
-        <w:t>Placeholder</w:t>
+          <w:sz w:val="28"/>
+          <w:szCs w:val="28"/>
+        </w:rPr>
+        <w:t>5</w:t>
+      </w:r>
+      <w:r>
+        <w:rPr>
+          <w:sz w:val="28"/>
+          <w:szCs w:val="28"/>
+        </w:rPr>
+        <w:t>;</w:t>
+      </w:r>
+    </w:p>
+    <w:p>
+      <w:pPr>
+        <w:pStyle w:val="newncpi"/>
+        <w:ind w:firstLine="709"/>
+        <w:rPr>
+          <w:sz w:val="28"/>
+          <w:szCs w:val="28"/>
+        </w:rPr>
+      </w:pPr>
+      <w:r>
+        <w:rPr>
+          <w:sz w:val="28"/>
+          <w:szCs w:val="28"/>
+        </w:rPr>
+        <w:t>П</w:t>
+      </w:r>
+      <w:r>
+        <w:rPr>
+          <w:sz w:val="28"/>
+          <w:szCs w:val="28"/>
+        </w:rPr>
+        <w:t xml:space="preserve">ропуск(а) </w:t>
+      </w:r>
+      <w:r>
+        <w:rPr>
+          <w:sz w:val="28"/>
+          <w:szCs w:val="28"/>
+        </w:rPr>
+        <w:t>п</w:t>
+      </w:r>
+      <w:r>
+        <w:rPr>
+          <w:sz w:val="28"/>
+          <w:szCs w:val="28"/>
+        </w:rPr>
+        <w:t xml:space="preserve">рошу выдать </w:t>
+      </w:r>
+      <w:r>
+        <w:rPr>
+          <w:sz w:val="28"/>
+          <w:szCs w:val="28"/>
+        </w:rPr>
+        <w:t>с целью</w:t>
+      </w:r>
+      <w:r>
+        <w:rPr>
+          <w:sz w:val="28"/>
+          <w:szCs w:val="28"/>
+        </w:rPr>
+        <w:t>:</w:t>
+      </w:r>
+      <w:r>
+        <w:rPr>
+          <w:sz w:val="28"/>
+          <w:szCs w:val="28"/>
+        </w:rPr>
+        <w:t xml:space="preserve"> </w:t>
       </w:r>
       <w:r>
         <w:rPr>
           <w:b/>
           <w:bCs/>
-          <w:i/>
-          <w:sz w:val="28"/>
-          <w:szCs w:val="28"/>
-        </w:rPr>
-        <w:t>_6</w:t>
-      </w:r>
-      <w:r>
-        <w:rPr>
-          <w:i/>
-          <w:sz w:val="28"/>
-          <w:szCs w:val="28"/>
-        </w:rPr>
-        <w:t>,</w:t>
+          <w:sz w:val="28"/>
+          <w:szCs w:val="28"/>
+          <w:lang w:val="en-US"/>
+        </w:rPr>
+        <w:t>Placeholder</w:t>
       </w:r>
       <w:r>
         <w:rPr>
           <w:b/>
           <w:bCs/>
-          <w:i/>
-          <w:sz w:val="28"/>
-          <w:szCs w:val="28"/>
-        </w:rPr>
-        <w:t xml:space="preserve"> </w:t>
-      </w:r>
-      <w:r>
-        <w:rPr>
-          <w:sz w:val="28"/>
-          <w:szCs w:val="28"/>
-        </w:rPr>
-        <w:t xml:space="preserve">на срок </w:t>
-      </w:r>
-      <w:r>
-        <w:rPr>
-          <w:i/>
-          <w:sz w:val="28"/>
-          <w:szCs w:val="28"/>
-        </w:rPr>
-        <w:t>с</w:t>
-      </w:r>
-      <w:r>
-        <w:rPr>
-          <w:i/>
+          <w:sz w:val="28"/>
+          <w:szCs w:val="28"/>
+        </w:rPr>
+        <w:t>_6</w:t>
+      </w:r>
+      <w:r>
+        <w:rPr>
+          <w:sz w:val="28"/>
+          <w:szCs w:val="28"/>
+        </w:rPr>
+        <w:t xml:space="preserve">, </w:t>
+      </w:r>
+      <w:r>
+        <w:rPr>
+          <w:sz w:val="28"/>
+          <w:szCs w:val="28"/>
+        </w:rPr>
+        <w:t>на срок с</w:t>
+      </w:r>
+      <w:r>
+        <w:rPr>
           <w:sz w:val="28"/>
           <w:szCs w:val="28"/>
         </w:rPr>
@@ -653,7 +662,6 @@
         <w:rPr>
           <w:b/>
           <w:bCs/>
-          <w:i/>
           <w:sz w:val="28"/>
           <w:szCs w:val="28"/>
           <w:lang w:val="en-US"/>
@@ -664,7 +672,6 @@
         <w:rPr>
           <w:b/>
           <w:bCs/>
-          <w:i/>
           <w:sz w:val="28"/>
           <w:szCs w:val="28"/>
         </w:rPr>
@@ -672,7 +679,6 @@
       </w:r>
       <w:r>
         <w:rPr>
-          <w:i/>
           <w:sz w:val="28"/>
           <w:szCs w:val="28"/>
         </w:rPr>
@@ -680,7 +686,6 @@
       </w:r>
       <w:r>
         <w:rPr>
-          <w:i/>
           <w:sz w:val="28"/>
           <w:szCs w:val="28"/>
         </w:rPr>
@@ -690,7 +695,6 @@
         <w:rPr>
           <w:b/>
           <w:bCs/>
-          <w:i/>
           <w:sz w:val="28"/>
           <w:szCs w:val="28"/>
           <w:lang w:val="en-US"/>
@@ -701,7 +705,6 @@
         <w:rPr>
           <w:b/>
           <w:bCs/>
-          <w:i/>
           <w:sz w:val="28"/>
           <w:szCs w:val="28"/>
         </w:rPr>
@@ -709,19 +712,10 @@
       </w:r>
       <w:r>
         <w:rPr>
-          <w:i/>
-          <w:sz w:val="28"/>
-          <w:szCs w:val="28"/>
-        </w:rPr>
-        <w:t>,</w:t>
-      </w:r>
-      <w:r>
-        <w:rPr>
-          <w:i/>
-          <w:sz w:val="28"/>
-          <w:szCs w:val="28"/>
-        </w:rPr>
-        <w:t xml:space="preserve"> </w:t>
+          <w:sz w:val="28"/>
+          <w:szCs w:val="28"/>
+        </w:rPr>
+        <w:t xml:space="preserve">, </w:t>
       </w:r>
       <w:r>
         <w:rPr>
@@ -760,7 +754,6 @@
       </w:pPr>
       <w:r>
         <w:rPr>
-          <w:i/>
           <w:sz w:val="28"/>
           <w:szCs w:val="28"/>
           <w:lang w:val="en-US"/>
@@ -769,7 +762,6 @@
       </w:r>
       <w:r>
         <w:rPr>
-          <w:i/>
           <w:sz w:val="28"/>
           <w:szCs w:val="28"/>
         </w:rPr>
@@ -777,7 +769,6 @@
       </w:r>
       <w:r>
         <w:rPr>
-          <w:i/>
           <w:sz w:val="28"/>
           <w:szCs w:val="28"/>
           <w:lang w:val="en-US"/>
@@ -786,7 +777,6 @@
       </w:r>
       <w:r>
         <w:rPr>
-          <w:i/>
           <w:sz w:val="28"/>
           <w:szCs w:val="28"/>
         </w:rPr>
@@ -794,7 +784,6 @@
       </w:r>
       <w:r>
         <w:rPr>
-          <w:i/>
           <w:sz w:val="28"/>
           <w:szCs w:val="28"/>
           <w:lang w:val="en-US"/>
@@ -803,7 +792,6 @@
       </w:r>
       <w:r>
         <w:rPr>
-          <w:i/>
           <w:sz w:val="28"/>
           <w:szCs w:val="28"/>
         </w:rPr>
@@ -811,7 +799,6 @@
       </w:r>
       <w:r>
         <w:rPr>
-          <w:i/>
           <w:sz w:val="28"/>
           <w:szCs w:val="28"/>
           <w:lang w:val="en-US"/>
@@ -820,7 +807,6 @@
       </w:r>
       <w:r>
         <w:rPr>
-          <w:i/>
           <w:sz w:val="28"/>
           <w:szCs w:val="28"/>
         </w:rPr>
@@ -828,7 +814,6 @@
       </w:r>
       <w:r>
         <w:rPr>
-          <w:i/>
           <w:sz w:val="28"/>
           <w:szCs w:val="28"/>
           <w:lang w:val="en-US"/>
@@ -837,22 +822,11 @@
       </w:r>
       <w:r>
         <w:rPr>
-          <w:i/>
           <w:sz w:val="28"/>
           <w:szCs w:val="28"/>
         </w:rPr>
         <w:t>_11</w:t>
       </w:r>
-    </w:p>
-    <w:p>
-      <w:pPr>
-        <w:pStyle w:val="newncpi"/>
-        <w:ind w:left="927" w:firstLine="709"/>
-        <w:rPr>
-          <w:sz w:val="28"/>
-          <w:szCs w:val="28"/>
-        </w:rPr>
-      </w:pPr>
     </w:p>
     <w:p>
       <w:pPr>
@@ -887,16 +861,12 @@
         </w:numPr>
         <w:ind w:left="0" w:firstLine="709"/>
         <w:rPr>
-          <w:i/>
-          <w:iCs/>
-          <w:sz w:val="28"/>
-          <w:szCs w:val="28"/>
-        </w:rPr>
-      </w:pPr>
-      <w:r>
-        <w:rPr>
-          <w:i/>
-          <w:iCs/>
+          <w:sz w:val="28"/>
+          <w:szCs w:val="28"/>
+        </w:rPr>
+      </w:pPr>
+      <w:r>
+        <w:rPr>
           <w:sz w:val="28"/>
           <w:szCs w:val="28"/>
         </w:rPr>
@@ -915,6 +885,7 @@
     </w:p>
     <w:p>
       <w:pPr>
+        <w:jc w:val="both"/>
         <w:rPr>
           <w:rFonts w:ascii="Times New Roman" w:hAnsi="Times New Roman"/>
           <w:sz w:val="28"/>
@@ -924,7 +895,6 @@
       <w:r>
         <w:rPr>
           <w:rFonts w:ascii="Times New Roman" w:hAnsi="Times New Roman"/>
-          <w:i/>
           <w:sz w:val="28"/>
           <w:szCs w:val="28"/>
           <w:lang w:val="en-US"/>
@@ -934,7 +904,6 @@
       <w:r>
         <w:rPr>
           <w:rFonts w:ascii="Times New Roman" w:hAnsi="Times New Roman"/>
-          <w:i/>
           <w:sz w:val="28"/>
           <w:szCs w:val="28"/>
         </w:rPr>
@@ -947,7 +916,6 @@
           <w:szCs w:val="28"/>
         </w:rPr>
         <w:tab/>
-        <w:t xml:space="preserve">           </w:t>
       </w:r>
       <w:r>
         <w:rPr>
@@ -955,7 +923,7 @@
           <w:sz w:val="28"/>
           <w:szCs w:val="28"/>
         </w:rPr>
-        <w:t xml:space="preserve">                                                             </w:t>
+        <w:t xml:space="preserve"> </w:t>
       </w:r>
       <w:r>
         <w:rPr>
@@ -963,6 +931,14 @@
           <w:sz w:val="28"/>
           <w:szCs w:val="28"/>
         </w:rPr>
+        <w:t xml:space="preserve">                                                                       </w:t>
+      </w:r>
+      <w:r>
+        <w:rPr>
+          <w:rFonts w:ascii="Times New Roman" w:hAnsi="Times New Roman"/>
+          <w:sz w:val="28"/>
+          <w:szCs w:val="28"/>
+        </w:rPr>
         <w:t xml:space="preserve">         </w:t>
       </w:r>
       <w:r>
@@ -987,15 +963,7 @@
           <w:sz w:val="28"/>
           <w:szCs w:val="28"/>
         </w:rPr>
-        <w:t>___________</w:t>
-      </w:r>
-      <w:r>
-        <w:rPr>
-          <w:rFonts w:ascii="Times New Roman" w:hAnsi="Times New Roman"/>
-          <w:sz w:val="28"/>
-          <w:szCs w:val="28"/>
-        </w:rPr>
-        <w:t xml:space="preserve"> </w:t>
+        <w:t xml:space="preserve">___________ </w:t>
       </w:r>
     </w:p>
     <w:p>
@@ -1014,16 +982,7 @@
           <w:szCs w:val="28"/>
           <w:vertAlign w:val="superscript"/>
         </w:rPr>
-        <w:t xml:space="preserve">                                                                                                                                                                                              </w:t>
-      </w:r>
-      <w:r>
-        <w:rPr>
-          <w:rFonts w:ascii="Times New Roman" w:hAnsi="Times New Roman"/>
-          <w:sz w:val="28"/>
-          <w:szCs w:val="28"/>
-          <w:vertAlign w:val="superscript"/>
-        </w:rPr>
-        <w:t>(подпись)</w:t>
+        <w:t xml:space="preserve">                                                                                                                                                                                              (подпись)</w:t>
       </w:r>
     </w:p>
     <w:p>
@@ -1069,15 +1028,7 @@
           <w:sz w:val="28"/>
           <w:szCs w:val="28"/>
         </w:rPr>
-        <w:t xml:space="preserve"> _______.</w:t>
-      </w:r>
-      <w:r>
-        <w:rPr>
-          <w:rFonts w:ascii="Times New Roman" w:hAnsi="Times New Roman"/>
-          <w:sz w:val="28"/>
-          <w:szCs w:val="28"/>
-        </w:rPr>
-        <w:t xml:space="preserve"> </w:t>
+        <w:t xml:space="preserve"> _______. </w:t>
       </w:r>
     </w:p>
     <w:p>
@@ -1096,16 +1047,7 @@
           <w:szCs w:val="28"/>
           <w:vertAlign w:val="superscript"/>
         </w:rPr>
-        <w:t xml:space="preserve">                                                                                                                                                                                                </w:t>
-      </w:r>
-      <w:r>
-        <w:rPr>
-          <w:rFonts w:ascii="Times New Roman" w:hAnsi="Times New Roman"/>
-          <w:sz w:val="28"/>
-          <w:szCs w:val="28"/>
-          <w:vertAlign w:val="superscript"/>
-        </w:rPr>
-        <w:t>(подпись)</w:t>
+        <w:t xml:space="preserve">                                                                                                                                                                                                (подпись)</w:t>
       </w:r>
     </w:p>
     <w:p>
@@ -1138,15 +1080,7 @@
           <w:sz w:val="28"/>
           <w:szCs w:val="28"/>
         </w:rPr>
-        <w:t>___________.</w:t>
-      </w:r>
-      <w:r>
-        <w:rPr>
-          <w:rFonts w:ascii="Times New Roman" w:hAnsi="Times New Roman"/>
-          <w:sz w:val="28"/>
-          <w:szCs w:val="28"/>
-        </w:rPr>
-        <w:t xml:space="preserve"> </w:t>
+        <w:t xml:space="preserve">___________. </w:t>
       </w:r>
     </w:p>
     <w:p>
@@ -1165,16 +1099,7 @@
           <w:szCs w:val="28"/>
           <w:vertAlign w:val="superscript"/>
         </w:rPr>
-        <w:t xml:space="preserve">                                                                                                                                               </w:t>
-      </w:r>
-      <w:r>
-        <w:rPr>
-          <w:rFonts w:ascii="Times New Roman" w:hAnsi="Times New Roman"/>
-          <w:sz w:val="28"/>
-          <w:szCs w:val="28"/>
-          <w:vertAlign w:val="superscript"/>
-        </w:rPr>
-        <w:t>(подпись)</w:t>
+        <w:t xml:space="preserve">                                                                                                                                               (подпись)</w:t>
       </w:r>
     </w:p>
     <w:sectPr>

</xml_diff>

<commit_message>
v0.1.24: fix paths - DB and templates now resolve next to exe (not _MEIPASS temp), external templates take priority; updated 14.3/14.5 templates
</commit_message>
<xml_diff>
--- a/templates/Заявление_14.3.docx
+++ b/templates/Заявление_14.3.docx
@@ -35,7 +35,7 @@
           </w:tcPr>
           <w:p>
             <w:pPr>
-              <w:spacing w:line="280" w:lineRule="exact"/>
+              <w:spacing w:after="240" w:line="280" w:lineRule="exact"/>
               <w:ind w:right="151"/>
               <w:rPr>
                 <w:rFonts w:ascii="Times New Roman" w:hAnsi="Times New Roman"/>
@@ -43,6 +43,7 @@
                 <w:szCs w:val="28"/>
               </w:rPr>
             </w:pPr>
+            <w:bookmarkStart w:id="0" w:name="_Hlk240380381"/>
             <w:r>
               <w:rPr>
                 <w:rFonts w:ascii="Times New Roman" w:hAnsi="Times New Roman"/>
@@ -68,7 +69,25 @@
                 <w:sz w:val="28"/>
                 <w:szCs w:val="28"/>
               </w:rPr>
-              <w:t>на осуществление административной процедуры в соответствии с пунктом 14.3 перечня административных процедур, осуществляемых государственными органами и иными организациями по заявлениям граждан, утвержденного Указом Президента Республики Беларусь от 26.04.2010 № 200</w:t>
+              <w:t xml:space="preserve">на осуществление административной процедуры в соответствии с пунктом </w:t>
+            </w:r>
+            <w:r>
+              <w:rPr>
+                <w:rFonts w:ascii="Times New Roman" w:hAnsi="Times New Roman"/>
+                <w:b/>
+                <w:bCs/>
+                <w:sz w:val="28"/>
+                <w:szCs w:val="28"/>
+              </w:rPr>
+              <w:t>14.3</w:t>
+            </w:r>
+            <w:r>
+              <w:rPr>
+                <w:rFonts w:ascii="Times New Roman" w:hAnsi="Times New Roman"/>
+                <w:sz w:val="28"/>
+                <w:szCs w:val="28"/>
+              </w:rPr>
+              <w:t xml:space="preserve"> перечня административных процедур, осуществляемых государственными органами и иными организациями по заявлениям граждан, утвержденного Указом Президента Республики Беларусь от 26.04.2010 № 200</w:t>
             </w:r>
           </w:p>
         </w:tc>
@@ -401,6 +420,7 @@
           </w:p>
         </w:tc>
       </w:tr>
+      <w:bookmarkEnd w:id="0"/>
     </w:tbl>
     <w:p>
       <w:pPr>
@@ -557,12 +577,13 @@
           <w:sz w:val="28"/>
           <w:szCs w:val="28"/>
         </w:rPr>
-        <w:t>;</w:t>
+        <w:t>.</w:t>
       </w:r>
     </w:p>
     <w:p>
       <w:pPr>
         <w:pStyle w:val="newncpi"/>
+        <w:spacing w:before="240"/>
         <w:ind w:firstLine="709"/>
         <w:rPr>
           <w:sz w:val="28"/>
@@ -748,12 +769,16 @@
         </w:numPr>
         <w:ind w:left="0" w:firstLine="709"/>
         <w:rPr>
-          <w:sz w:val="28"/>
-          <w:szCs w:val="28"/>
-        </w:rPr>
-      </w:pPr>
-      <w:r>
-        <w:rPr>
+          <w:b/>
+          <w:bCs/>
+          <w:sz w:val="28"/>
+          <w:szCs w:val="28"/>
+        </w:rPr>
+      </w:pPr>
+      <w:r>
+        <w:rPr>
+          <w:b/>
+          <w:bCs/>
           <w:sz w:val="28"/>
           <w:szCs w:val="28"/>
           <w:lang w:val="en-US"/>
@@ -762,6 +787,8 @@
       </w:r>
       <w:r>
         <w:rPr>
+          <w:b/>
+          <w:bCs/>
           <w:sz w:val="28"/>
           <w:szCs w:val="28"/>
         </w:rPr>
@@ -769,6 +796,8 @@
       </w:r>
       <w:r>
         <w:rPr>
+          <w:b/>
+          <w:bCs/>
           <w:sz w:val="28"/>
           <w:szCs w:val="28"/>
           <w:lang w:val="en-US"/>
@@ -777,6 +806,8 @@
       </w:r>
       <w:r>
         <w:rPr>
+          <w:b/>
+          <w:bCs/>
           <w:sz w:val="28"/>
           <w:szCs w:val="28"/>
         </w:rPr>
@@ -784,6 +815,8 @@
       </w:r>
       <w:r>
         <w:rPr>
+          <w:b/>
+          <w:bCs/>
           <w:sz w:val="28"/>
           <w:szCs w:val="28"/>
           <w:lang w:val="en-US"/>
@@ -792,6 +825,8 @@
       </w:r>
       <w:r>
         <w:rPr>
+          <w:b/>
+          <w:bCs/>
           <w:sz w:val="28"/>
           <w:szCs w:val="28"/>
         </w:rPr>
@@ -799,6 +834,8 @@
       </w:r>
       <w:r>
         <w:rPr>
+          <w:b/>
+          <w:bCs/>
           <w:sz w:val="28"/>
           <w:szCs w:val="28"/>
           <w:lang w:val="en-US"/>
@@ -807,6 +844,8 @@
       </w:r>
       <w:r>
         <w:rPr>
+          <w:b/>
+          <w:bCs/>
           <w:sz w:val="28"/>
           <w:szCs w:val="28"/>
         </w:rPr>
@@ -814,6 +853,8 @@
       </w:r>
       <w:r>
         <w:rPr>
+          <w:b/>
+          <w:bCs/>
           <w:sz w:val="28"/>
           <w:szCs w:val="28"/>
           <w:lang w:val="en-US"/>
@@ -822,6 +863,8 @@
       </w:r>
       <w:r>
         <w:rPr>
+          <w:b/>
+          <w:bCs/>
           <w:sz w:val="28"/>
           <w:szCs w:val="28"/>
         </w:rPr>
@@ -831,6 +874,7 @@
     <w:p>
       <w:pPr>
         <w:pStyle w:val="newncpi"/>
+        <w:spacing w:before="240"/>
         <w:ind w:firstLine="709"/>
         <w:rPr>
           <w:sz w:val="28"/>
@@ -861,12 +905,16 @@
         </w:numPr>
         <w:ind w:left="0" w:firstLine="709"/>
         <w:rPr>
-          <w:sz w:val="28"/>
-          <w:szCs w:val="28"/>
-        </w:rPr>
-      </w:pPr>
-      <w:r>
-        <w:rPr>
+          <w:b/>
+          <w:bCs/>
+          <w:sz w:val="28"/>
+          <w:szCs w:val="28"/>
+        </w:rPr>
+      </w:pPr>
+      <w:r>
+        <w:rPr>
+          <w:b/>
+          <w:bCs/>
           <w:sz w:val="28"/>
           <w:szCs w:val="28"/>
         </w:rPr>
@@ -883,224 +931,550 @@
         </w:rPr>
       </w:pPr>
     </w:p>
+    <w:tbl>
+      <w:tblPr>
+        <w:tblStyle w:val="af4"/>
+        <w:tblW w:w="5000" w:type="pct"/>
+        <w:tblBorders>
+          <w:top w:val="none" w:sz="0" w:space="0" w:color="auto"/>
+          <w:left w:val="none" w:sz="0" w:space="0" w:color="auto"/>
+          <w:bottom w:val="none" w:sz="0" w:space="0" w:color="auto"/>
+          <w:right w:val="none" w:sz="0" w:space="0" w:color="auto"/>
+          <w:insideH w:val="none" w:sz="0" w:space="0" w:color="auto"/>
+          <w:insideV w:val="none" w:sz="0" w:space="0" w:color="auto"/>
+        </w:tblBorders>
+        <w:tblLook w:val="04A0" w:firstRow="1" w:lastRow="0" w:firstColumn="1" w:lastColumn="0" w:noHBand="0" w:noVBand="1"/>
+      </w:tblPr>
+      <w:tblGrid>
+        <w:gridCol w:w="1944"/>
+        <w:gridCol w:w="4761"/>
+        <w:gridCol w:w="1527"/>
+        <w:gridCol w:w="1622"/>
+      </w:tblGrid>
+      <w:tr>
+        <w:tc>
+          <w:tcPr>
+            <w:tcW w:w="986" w:type="pct"/>
+          </w:tcPr>
+          <w:p>
+            <w:pPr>
+              <w:jc w:val="both"/>
+              <w:rPr>
+                <w:rFonts w:ascii="Times New Roman" w:hAnsi="Times New Roman"/>
+                <w:sz w:val="28"/>
+                <w:szCs w:val="28"/>
+              </w:rPr>
+            </w:pPr>
+            <w:bookmarkStart w:id="1" w:name="_Hlk240380583"/>
+            <w:r>
+              <w:rPr>
+                <w:rFonts w:ascii="Times New Roman" w:hAnsi="Times New Roman"/>
+                <w:sz w:val="28"/>
+                <w:szCs w:val="28"/>
+                <w:lang w:val="en-US"/>
+              </w:rPr>
+              <w:t>Placeholder</w:t>
+            </w:r>
+            <w:r>
+              <w:rPr>
+                <w:rFonts w:ascii="Times New Roman" w:hAnsi="Times New Roman"/>
+                <w:sz w:val="28"/>
+                <w:szCs w:val="28"/>
+              </w:rPr>
+              <w:t xml:space="preserve">_9 </w:t>
+            </w:r>
+          </w:p>
+        </w:tc>
+        <w:tc>
+          <w:tcPr>
+            <w:tcW w:w="3191" w:type="pct"/>
+            <w:gridSpan w:val="2"/>
+          </w:tcPr>
+          <w:p>
+            <w:pPr>
+              <w:jc w:val="right"/>
+              <w:rPr>
+                <w:rFonts w:ascii="Times New Roman" w:hAnsi="Times New Roman"/>
+                <w:sz w:val="28"/>
+                <w:szCs w:val="28"/>
+              </w:rPr>
+            </w:pPr>
+            <w:r>
+              <w:rPr>
+                <w:rFonts w:ascii="Times New Roman" w:hAnsi="Times New Roman"/>
+                <w:sz w:val="28"/>
+                <w:szCs w:val="28"/>
+                <w:lang w:val="en-US"/>
+              </w:rPr>
+              <w:t>Placeholder</w:t>
+            </w:r>
+            <w:r>
+              <w:rPr>
+                <w:rFonts w:ascii="Times New Roman" w:hAnsi="Times New Roman"/>
+                <w:sz w:val="28"/>
+                <w:szCs w:val="28"/>
+              </w:rPr>
+              <w:t xml:space="preserve">_1.1 </w:t>
+            </w:r>
+            <w:r>
+              <w:rPr>
+                <w:rFonts w:ascii="Times New Roman" w:hAnsi="Times New Roman"/>
+                <w:sz w:val="28"/>
+                <w:szCs w:val="28"/>
+                <w:lang w:val="en-US"/>
+              </w:rPr>
+              <w:t>Placeholder</w:t>
+            </w:r>
+            <w:r>
+              <w:rPr>
+                <w:rFonts w:ascii="Times New Roman" w:hAnsi="Times New Roman"/>
+                <w:sz w:val="28"/>
+                <w:szCs w:val="28"/>
+              </w:rPr>
+              <w:t xml:space="preserve">_1.2 </w:t>
+            </w:r>
+            <w:r>
+              <w:rPr>
+                <w:rFonts w:ascii="Times New Roman" w:hAnsi="Times New Roman"/>
+                <w:sz w:val="28"/>
+                <w:szCs w:val="28"/>
+                <w:lang w:val="en-US"/>
+              </w:rPr>
+              <w:t>Placeholder</w:t>
+            </w:r>
+            <w:r>
+              <w:rPr>
+                <w:rFonts w:ascii="Times New Roman" w:hAnsi="Times New Roman"/>
+                <w:sz w:val="28"/>
+                <w:szCs w:val="28"/>
+              </w:rPr>
+              <w:t>_1.3</w:t>
+            </w:r>
+          </w:p>
+        </w:tc>
+        <w:tc>
+          <w:tcPr>
+            <w:tcW w:w="824" w:type="pct"/>
+            <w:tcBorders>
+              <w:bottom w:val="single" w:sz="4" w:space="0" w:color="auto"/>
+            </w:tcBorders>
+          </w:tcPr>
+          <w:p>
+            <w:pPr>
+              <w:jc w:val="both"/>
+              <w:rPr>
+                <w:rFonts w:ascii="Times New Roman" w:hAnsi="Times New Roman"/>
+                <w:sz w:val="28"/>
+                <w:szCs w:val="28"/>
+                <w:lang w:val="en-US"/>
+              </w:rPr>
+            </w:pPr>
+          </w:p>
+        </w:tc>
+      </w:tr>
+      <w:tr>
+        <w:trPr>
+          <w:trHeight w:val="269"/>
+        </w:trPr>
+        <w:tc>
+          <w:tcPr>
+            <w:tcW w:w="4176" w:type="pct"/>
+            <w:gridSpan w:val="3"/>
+          </w:tcPr>
+          <w:p>
+            <w:pPr>
+              <w:rPr>
+                <w:rFonts w:ascii="Times New Roman" w:hAnsi="Times New Roman"/>
+                <w:sz w:val="26"/>
+                <w:szCs w:val="26"/>
+                <w:vertAlign w:val="superscript"/>
+              </w:rPr>
+            </w:pPr>
+          </w:p>
+        </w:tc>
+        <w:tc>
+          <w:tcPr>
+            <w:tcW w:w="824" w:type="pct"/>
+            <w:tcBorders>
+              <w:top w:val="single" w:sz="4" w:space="0" w:color="auto"/>
+            </w:tcBorders>
+          </w:tcPr>
+          <w:p>
+            <w:pPr>
+              <w:jc w:val="center"/>
+              <w:rPr>
+                <w:rFonts w:ascii="Times New Roman" w:hAnsi="Times New Roman"/>
+                <w:sz w:val="28"/>
+                <w:szCs w:val="28"/>
+                <w:vertAlign w:val="superscript"/>
+              </w:rPr>
+            </w:pPr>
+            <w:r>
+              <w:rPr>
+                <w:rFonts w:ascii="Times New Roman" w:hAnsi="Times New Roman"/>
+                <w:sz w:val="28"/>
+                <w:szCs w:val="28"/>
+                <w:vertAlign w:val="superscript"/>
+              </w:rPr>
+              <w:t>(</w:t>
+            </w:r>
+            <w:r>
+              <w:rPr>
+                <w:rFonts w:ascii="Times New Roman" w:hAnsi="Times New Roman"/>
+                <w:sz w:val="28"/>
+                <w:szCs w:val="28"/>
+                <w:vertAlign w:val="superscript"/>
+              </w:rPr>
+              <w:t>подпись)</w:t>
+            </w:r>
+          </w:p>
+        </w:tc>
+      </w:tr>
+      <w:tr>
+        <w:trPr>
+          <w:trHeight w:val="269"/>
+        </w:trPr>
+        <w:tc>
+          <w:tcPr>
+            <w:tcW w:w="4176" w:type="pct"/>
+            <w:gridSpan w:val="3"/>
+          </w:tcPr>
+          <w:p>
+            <w:pPr>
+              <w:rPr>
+                <w:rFonts w:ascii="Times New Roman" w:hAnsi="Times New Roman"/>
+                <w:sz w:val="28"/>
+                <w:szCs w:val="28"/>
+                <w:vertAlign w:val="superscript"/>
+              </w:rPr>
+            </w:pPr>
+          </w:p>
+        </w:tc>
+        <w:tc>
+          <w:tcPr>
+            <w:tcW w:w="824" w:type="pct"/>
+          </w:tcPr>
+          <w:p>
+            <w:pPr>
+              <w:jc w:val="center"/>
+              <w:rPr>
+                <w:rFonts w:ascii="Times New Roman" w:hAnsi="Times New Roman"/>
+                <w:sz w:val="28"/>
+                <w:szCs w:val="28"/>
+                <w:vertAlign w:val="superscript"/>
+              </w:rPr>
+            </w:pPr>
+          </w:p>
+        </w:tc>
+      </w:tr>
+      <w:tr>
+        <w:trPr>
+          <w:trHeight w:val="269"/>
+        </w:trPr>
+        <w:tc>
+          <w:tcPr>
+            <w:tcW w:w="4176" w:type="pct"/>
+            <w:gridSpan w:val="3"/>
+          </w:tcPr>
+          <w:p>
+            <w:pPr>
+              <w:jc w:val="both"/>
+              <w:rPr>
+                <w:rFonts w:ascii="Times New Roman" w:hAnsi="Times New Roman"/>
+                <w:sz w:val="28"/>
+                <w:szCs w:val="28"/>
+                <w:vertAlign w:val="superscript"/>
+              </w:rPr>
+            </w:pPr>
+            <w:r>
+              <w:rPr>
+                <w:rFonts w:ascii="Times New Roman" w:hAnsi="Times New Roman"/>
+                <w:sz w:val="28"/>
+                <w:szCs w:val="28"/>
+              </w:rPr>
+              <w:t>Подтверждаю, что о</w:t>
+            </w:r>
+            <w:r>
+              <w:rPr>
+                <w:rFonts w:ascii="Times New Roman" w:hAnsi="Times New Roman"/>
+                <w:sz w:val="28"/>
+                <w:szCs w:val="28"/>
+              </w:rPr>
+              <w:t>знакомлен(а) с</w:t>
+            </w:r>
+            <w:r>
+              <w:rPr>
+                <w:rFonts w:ascii="Times New Roman" w:hAnsi="Times New Roman"/>
+                <w:sz w:val="28"/>
+                <w:szCs w:val="28"/>
+              </w:rPr>
+              <w:t xml:space="preserve"> мерами радиационной и пожарной безопасности</w:t>
+            </w:r>
+            <w:r>
+              <w:rPr>
+                <w:rFonts w:ascii="Times New Roman" w:hAnsi="Times New Roman"/>
+                <w:sz w:val="28"/>
+                <w:szCs w:val="28"/>
+              </w:rPr>
+              <w:t xml:space="preserve">, </w:t>
+            </w:r>
+            <w:r>
+              <w:rPr>
+                <w:sz w:val="28"/>
+                <w:szCs w:val="28"/>
+              </w:rPr>
+              <w:t>правилами въезда (входа) в пограничную зону (полосу), порядком пребывания и передвижения в ней</w:t>
+            </w:r>
+            <w:r>
+              <w:rPr>
+                <w:sz w:val="28"/>
+                <w:szCs w:val="28"/>
+              </w:rPr>
+              <w:t>.</w:t>
+            </w:r>
+          </w:p>
+        </w:tc>
+        <w:tc>
+          <w:tcPr>
+            <w:tcW w:w="824" w:type="pct"/>
+            <w:tcBorders>
+              <w:bottom w:val="single" w:sz="4" w:space="0" w:color="auto"/>
+            </w:tcBorders>
+          </w:tcPr>
+          <w:p>
+            <w:pPr>
+              <w:jc w:val="center"/>
+              <w:rPr>
+                <w:rFonts w:ascii="Times New Roman" w:hAnsi="Times New Roman"/>
+                <w:sz w:val="28"/>
+                <w:szCs w:val="28"/>
+                <w:vertAlign w:val="superscript"/>
+              </w:rPr>
+            </w:pPr>
+          </w:p>
+        </w:tc>
+      </w:tr>
+      <w:tr>
+        <w:trPr>
+          <w:trHeight w:val="269"/>
+        </w:trPr>
+        <w:tc>
+          <w:tcPr>
+            <w:tcW w:w="4176" w:type="pct"/>
+            <w:gridSpan w:val="3"/>
+          </w:tcPr>
+          <w:p>
+            <w:pPr>
+              <w:rPr>
+                <w:rFonts w:ascii="Times New Roman" w:hAnsi="Times New Roman"/>
+                <w:sz w:val="28"/>
+                <w:szCs w:val="28"/>
+                <w:vertAlign w:val="superscript"/>
+              </w:rPr>
+            </w:pPr>
+          </w:p>
+        </w:tc>
+        <w:tc>
+          <w:tcPr>
+            <w:tcW w:w="824" w:type="pct"/>
+            <w:tcBorders>
+              <w:top w:val="single" w:sz="4" w:space="0" w:color="auto"/>
+            </w:tcBorders>
+          </w:tcPr>
+          <w:p>
+            <w:pPr>
+              <w:jc w:val="center"/>
+              <w:rPr>
+                <w:rFonts w:ascii="Times New Roman" w:hAnsi="Times New Roman"/>
+                <w:sz w:val="28"/>
+                <w:szCs w:val="28"/>
+                <w:vertAlign w:val="superscript"/>
+              </w:rPr>
+            </w:pPr>
+            <w:r>
+              <w:rPr>
+                <w:rFonts w:ascii="Times New Roman" w:hAnsi="Times New Roman"/>
+                <w:sz w:val="28"/>
+                <w:szCs w:val="28"/>
+                <w:vertAlign w:val="superscript"/>
+              </w:rPr>
+              <w:t>(</w:t>
+            </w:r>
+            <w:r>
+              <w:rPr>
+                <w:rFonts w:ascii="Times New Roman" w:hAnsi="Times New Roman"/>
+                <w:sz w:val="28"/>
+                <w:szCs w:val="28"/>
+                <w:vertAlign w:val="superscript"/>
+              </w:rPr>
+              <w:t>подпись)</w:t>
+            </w:r>
+          </w:p>
+        </w:tc>
+      </w:tr>
+      <w:tr>
+        <w:tc>
+          <w:tcPr>
+            <w:tcW w:w="986" w:type="pct"/>
+          </w:tcPr>
+          <w:p>
+            <w:pPr>
+              <w:jc w:val="both"/>
+              <w:rPr>
+                <w:rFonts w:ascii="Times New Roman" w:hAnsi="Times New Roman"/>
+                <w:sz w:val="28"/>
+                <w:szCs w:val="28"/>
+              </w:rPr>
+            </w:pPr>
+            <w:r>
+              <w:rPr>
+                <w:rFonts w:ascii="Times New Roman" w:hAnsi="Times New Roman"/>
+                <w:sz w:val="28"/>
+                <w:szCs w:val="28"/>
+              </w:rPr>
+              <w:t xml:space="preserve">Пропуск(а) </w:t>
+            </w:r>
+            <w:r>
+              <w:rPr>
+                <w:rFonts w:ascii="Times New Roman" w:hAnsi="Times New Roman"/>
+                <w:bCs/>
+                <w:sz w:val="28"/>
+                <w:szCs w:val="28"/>
+              </w:rPr>
+              <w:t>№</w:t>
+            </w:r>
+          </w:p>
+        </w:tc>
+        <w:tc>
+          <w:tcPr>
+            <w:tcW w:w="2416" w:type="pct"/>
+            <w:tcBorders>
+              <w:bottom w:val="single" w:sz="4" w:space="0" w:color="auto"/>
+            </w:tcBorders>
+          </w:tcPr>
+          <w:p>
+            <w:pPr>
+              <w:jc w:val="right"/>
+              <w:rPr>
+                <w:rFonts w:ascii="Times New Roman" w:hAnsi="Times New Roman"/>
+                <w:sz w:val="28"/>
+                <w:szCs w:val="28"/>
+              </w:rPr>
+            </w:pPr>
+          </w:p>
+        </w:tc>
+        <w:tc>
+          <w:tcPr>
+            <w:tcW w:w="775" w:type="pct"/>
+          </w:tcPr>
+          <w:p>
+            <w:pPr>
+              <w:jc w:val="right"/>
+              <w:rPr>
+                <w:rFonts w:ascii="Times New Roman" w:hAnsi="Times New Roman"/>
+                <w:sz w:val="28"/>
+                <w:szCs w:val="28"/>
+              </w:rPr>
+            </w:pPr>
+            <w:r>
+              <w:rPr>
+                <w:rFonts w:ascii="Times New Roman" w:hAnsi="Times New Roman"/>
+                <w:sz w:val="28"/>
+                <w:szCs w:val="28"/>
+              </w:rPr>
+              <w:t>получил(а)</w:t>
+            </w:r>
+          </w:p>
+        </w:tc>
+        <w:tc>
+          <w:tcPr>
+            <w:tcW w:w="824" w:type="pct"/>
+            <w:tcBorders>
+              <w:bottom w:val="single" w:sz="4" w:space="0" w:color="auto"/>
+            </w:tcBorders>
+          </w:tcPr>
+          <w:p>
+            <w:pPr>
+              <w:jc w:val="both"/>
+              <w:rPr>
+                <w:rFonts w:ascii="Times New Roman" w:hAnsi="Times New Roman"/>
+                <w:sz w:val="28"/>
+                <w:szCs w:val="28"/>
+                <w:lang w:val="en-US"/>
+              </w:rPr>
+            </w:pPr>
+          </w:p>
+        </w:tc>
+      </w:tr>
+      <w:tr>
+        <w:trPr>
+          <w:trHeight w:val="269"/>
+        </w:trPr>
+        <w:tc>
+          <w:tcPr>
+            <w:tcW w:w="4176" w:type="pct"/>
+            <w:gridSpan w:val="3"/>
+          </w:tcPr>
+          <w:p>
+            <w:pPr>
+              <w:rPr>
+                <w:rFonts w:ascii="Times New Roman" w:hAnsi="Times New Roman"/>
+                <w:sz w:val="26"/>
+                <w:szCs w:val="26"/>
+                <w:vertAlign w:val="superscript"/>
+              </w:rPr>
+            </w:pPr>
+          </w:p>
+        </w:tc>
+        <w:tc>
+          <w:tcPr>
+            <w:tcW w:w="824" w:type="pct"/>
+            <w:tcBorders>
+              <w:top w:val="single" w:sz="4" w:space="0" w:color="auto"/>
+            </w:tcBorders>
+          </w:tcPr>
+          <w:p>
+            <w:pPr>
+              <w:jc w:val="center"/>
+              <w:rPr>
+                <w:rFonts w:ascii="Times New Roman" w:hAnsi="Times New Roman"/>
+                <w:sz w:val="28"/>
+                <w:szCs w:val="28"/>
+                <w:vertAlign w:val="superscript"/>
+              </w:rPr>
+            </w:pPr>
+            <w:r>
+              <w:rPr>
+                <w:rFonts w:ascii="Times New Roman" w:hAnsi="Times New Roman"/>
+                <w:sz w:val="28"/>
+                <w:szCs w:val="28"/>
+                <w:vertAlign w:val="superscript"/>
+              </w:rPr>
+              <w:t>(</w:t>
+            </w:r>
+            <w:r>
+              <w:rPr>
+                <w:rFonts w:ascii="Times New Roman" w:hAnsi="Times New Roman"/>
+                <w:sz w:val="28"/>
+                <w:szCs w:val="28"/>
+                <w:vertAlign w:val="superscript"/>
+              </w:rPr>
+              <w:t>подпись)</w:t>
+            </w:r>
+          </w:p>
+        </w:tc>
+      </w:tr>
+      <w:bookmarkEnd w:id="1"/>
+    </w:tbl>
     <w:p>
       <w:pPr>
-        <w:jc w:val="both"/>
+        <w:ind w:firstLine="567"/>
         <w:rPr>
           <w:rFonts w:ascii="Times New Roman" w:hAnsi="Times New Roman"/>
           <w:sz w:val="28"/>
           <w:szCs w:val="28"/>
         </w:rPr>
       </w:pPr>
-      <w:r>
-        <w:rPr>
-          <w:rFonts w:ascii="Times New Roman" w:hAnsi="Times New Roman"/>
-          <w:sz w:val="28"/>
-          <w:szCs w:val="28"/>
-          <w:lang w:val="en-US"/>
-        </w:rPr>
-        <w:t>Placeholder</w:t>
-      </w:r>
-      <w:r>
-        <w:rPr>
-          <w:rFonts w:ascii="Times New Roman" w:hAnsi="Times New Roman"/>
-          <w:sz w:val="28"/>
-          <w:szCs w:val="28"/>
-        </w:rPr>
-        <w:t>_9</w:t>
-      </w:r>
-      <w:r>
-        <w:rPr>
-          <w:rFonts w:ascii="Times New Roman" w:hAnsi="Times New Roman"/>
-          <w:sz w:val="28"/>
-          <w:szCs w:val="28"/>
-        </w:rPr>
-        <w:tab/>
-      </w:r>
-      <w:r>
-        <w:rPr>
-          <w:rFonts w:ascii="Times New Roman" w:hAnsi="Times New Roman"/>
-          <w:sz w:val="28"/>
-          <w:szCs w:val="28"/>
-        </w:rPr>
-        <w:t xml:space="preserve"> </w:t>
-      </w:r>
-      <w:r>
-        <w:rPr>
-          <w:rFonts w:ascii="Times New Roman" w:hAnsi="Times New Roman"/>
-          <w:sz w:val="28"/>
-          <w:szCs w:val="28"/>
-        </w:rPr>
-        <w:t xml:space="preserve">                                                                       </w:t>
-      </w:r>
-      <w:r>
-        <w:rPr>
-          <w:rFonts w:ascii="Times New Roman" w:hAnsi="Times New Roman"/>
-          <w:sz w:val="28"/>
-          <w:szCs w:val="28"/>
-        </w:rPr>
-        <w:t xml:space="preserve">         </w:t>
-      </w:r>
-      <w:r>
-        <w:rPr>
-          <w:rFonts w:ascii="Times New Roman" w:hAnsi="Times New Roman"/>
-          <w:sz w:val="28"/>
-          <w:szCs w:val="28"/>
-        </w:rPr>
-        <w:t xml:space="preserve">   </w:t>
-      </w:r>
-      <w:r>
-        <w:rPr>
-          <w:rFonts w:ascii="Times New Roman" w:hAnsi="Times New Roman"/>
-          <w:sz w:val="28"/>
-          <w:szCs w:val="28"/>
-        </w:rPr>
-        <w:t xml:space="preserve"> </w:t>
-      </w:r>
-      <w:r>
-        <w:rPr>
-          <w:rFonts w:ascii="Times New Roman" w:hAnsi="Times New Roman"/>
-          <w:sz w:val="28"/>
-          <w:szCs w:val="28"/>
-        </w:rPr>
-        <w:t xml:space="preserve">___________ </w:t>
-      </w:r>
-    </w:p>
-    <w:p>
-      <w:pPr>
-        <w:rPr>
-          <w:rFonts w:ascii="Times New Roman" w:hAnsi="Times New Roman"/>
-          <w:sz w:val="28"/>
-          <w:szCs w:val="28"/>
-          <w:vertAlign w:val="superscript"/>
-        </w:rPr>
-      </w:pPr>
-      <w:r>
-        <w:rPr>
-          <w:rFonts w:ascii="Times New Roman" w:hAnsi="Times New Roman"/>
-          <w:sz w:val="28"/>
-          <w:szCs w:val="28"/>
-          <w:vertAlign w:val="superscript"/>
-        </w:rPr>
-        <w:t xml:space="preserve">                                                                                                                                                                                              (подпись)</w:t>
-      </w:r>
-    </w:p>
-    <w:p>
-      <w:pPr>
-        <w:ind w:firstLine="567"/>
-        <w:rPr>
-          <w:rFonts w:ascii="Times New Roman" w:hAnsi="Times New Roman"/>
-          <w:sz w:val="28"/>
-          <w:szCs w:val="28"/>
-        </w:rPr>
-      </w:pPr>
-    </w:p>
-    <w:p>
-      <w:pPr>
-        <w:ind w:firstLine="567"/>
-        <w:rPr>
-          <w:rFonts w:ascii="Times New Roman" w:hAnsi="Times New Roman"/>
-          <w:sz w:val="28"/>
-          <w:szCs w:val="28"/>
-        </w:rPr>
-      </w:pPr>
-    </w:p>
-    <w:p>
-      <w:pPr>
-        <w:ind w:firstLine="567"/>
-        <w:rPr>
-          <w:rFonts w:ascii="Times New Roman" w:hAnsi="Times New Roman"/>
-          <w:sz w:val="28"/>
-          <w:szCs w:val="28"/>
-        </w:rPr>
-      </w:pPr>
-      <w:r>
-        <w:rPr>
-          <w:rFonts w:ascii="Times New Roman" w:hAnsi="Times New Roman"/>
-          <w:sz w:val="28"/>
-          <w:szCs w:val="28"/>
-        </w:rPr>
-        <w:t>С мерами радиационной и пожарной безопасности ознакомлен(а)</w:t>
-      </w:r>
-      <w:r>
-        <w:rPr>
-          <w:rFonts w:ascii="Times New Roman" w:hAnsi="Times New Roman"/>
-          <w:sz w:val="28"/>
-          <w:szCs w:val="28"/>
-        </w:rPr>
-        <w:t xml:space="preserve"> _______. </w:t>
-      </w:r>
-    </w:p>
-    <w:p>
-      <w:pPr>
-        <w:rPr>
-          <w:rFonts w:ascii="Times New Roman" w:hAnsi="Times New Roman"/>
-          <w:sz w:val="28"/>
-          <w:szCs w:val="28"/>
-          <w:vertAlign w:val="superscript"/>
-        </w:rPr>
-      </w:pPr>
-      <w:r>
-        <w:rPr>
-          <w:rFonts w:ascii="Times New Roman" w:hAnsi="Times New Roman"/>
-          <w:sz w:val="28"/>
-          <w:szCs w:val="28"/>
-          <w:vertAlign w:val="superscript"/>
-        </w:rPr>
-        <w:t xml:space="preserve">                                                                                                                                                                                                (подпись)</w:t>
-      </w:r>
-    </w:p>
-    <w:p>
-      <w:pPr>
-        <w:ind w:firstLine="567"/>
-        <w:jc w:val="both"/>
-        <w:rPr>
-          <w:rFonts w:ascii="Times New Roman" w:hAnsi="Times New Roman"/>
-          <w:sz w:val="28"/>
-          <w:szCs w:val="28"/>
-        </w:rPr>
-      </w:pPr>
-      <w:r>
-        <w:rPr>
-          <w:sz w:val="28"/>
-          <w:szCs w:val="28"/>
-        </w:rPr>
-        <w:t>С правилами въезда (входа) в пограничную зону (полосу), порядком пребывания и передвижения в ней ознакомлен(а)</w:t>
-      </w:r>
-      <w:r>
-        <w:rPr>
-          <w:sz w:val="28"/>
-          <w:szCs w:val="28"/>
-        </w:rPr>
-        <w:t xml:space="preserve"> </w:t>
-      </w:r>
-      <w:r>
-        <w:rPr>
-          <w:rFonts w:ascii="Times New Roman" w:hAnsi="Times New Roman"/>
-          <w:sz w:val="28"/>
-          <w:szCs w:val="28"/>
-        </w:rPr>
-        <w:t xml:space="preserve">___________. </w:t>
-      </w:r>
-    </w:p>
-    <w:p>
-      <w:pPr>
-        <w:rPr>
-          <w:rFonts w:ascii="Times New Roman" w:hAnsi="Times New Roman"/>
-          <w:sz w:val="28"/>
-          <w:szCs w:val="28"/>
-          <w:vertAlign w:val="superscript"/>
-        </w:rPr>
-      </w:pPr>
-      <w:r>
-        <w:rPr>
-          <w:rFonts w:ascii="Times New Roman" w:hAnsi="Times New Roman"/>
-          <w:sz w:val="28"/>
-          <w:szCs w:val="28"/>
-          <w:vertAlign w:val="superscript"/>
-        </w:rPr>
-        <w:t xml:space="preserve">                                                                                                                                               (подпись)</w:t>
-      </w:r>
     </w:p>
     <w:sectPr>
       <w:headerReference w:type="default" r:id="rId8"/>

</xml_diff>

<commit_message>
fix: corrected Заявление_14.3.docx template (user-found error)
</commit_message>
<xml_diff>
--- a/templates/Заявление_14.3.docx
+++ b/templates/Заявление_14.3.docx
@@ -1478,7 +1478,6 @@
     </w:p>
     <w:sectPr>
       <w:headerReference w:type="default" r:id="rId8"/>
-      <w:footerReference w:type="default" r:id="rId9"/>
       <w:pgSz w:w="11906" w:h="16838"/>
       <w:pgMar w:top="1134" w:right="567" w:bottom="1134" w:left="1701" w:header="709" w:footer="709" w:gutter="0"/>
       <w:cols w:space="708"/>
@@ -1505,149 +1504,6 @@
     </w:p>
   </w:endnote>
 </w:endnotes>
-</file>
-
-<file path=word/footer1.xml><?xml version="1.0" encoding="utf-8"?>
-<w:ftr xmlns:wpc="http://schemas.microsoft.com/office/word/2010/wordprocessingCanvas" xmlns:cx="http://schemas.microsoft.com/office/drawing/2014/chartex" xmlns:cx1="http://schemas.microsoft.com/office/drawing/2015/9/8/chartex" xmlns:cx2="http://schemas.microsoft.com/office/drawing/2015/10/21/chartex" xmlns:cx3="http://schemas.microsoft.com/office/drawing/2016/5/9/chartex" xmlns:cx4="http://schemas.microsoft.com/office/drawing/2016/5/10/chartex" xmlns:cx5="http://schemas.microsoft.com/office/drawing/2016/5/11/chartex" xmlns:cx6="http://schemas.microsoft.com/office/drawing/2016/5/12/chartex" xmlns:cx7="http://schemas.microsoft.com/office/drawing/2016/5/13/chartex" xmlns:cx8="http://schemas.microsoft.com/office/drawing/2016/5/14/chartex" xmlns:mc="http://schemas.openxmlformats.org/markup-compatibility/2006" xmlns:aink="http://schemas.microsoft.com/office/drawing/2016/ink" xmlns:am3d="http://schemas.microsoft.com/office/drawing/2017/model3d" xmlns:o="urn:schemas-microsoft-com:office:office" xmlns:oel="http://schemas.microsoft.com/office/2019/extlst" xmlns:r="http://schemas.openxmlformats.org/officeDocument/2006/relationships" xmlns:m="http://schemas.openxmlformats.org/officeDocument/2006/math" xmlns:v="urn:schemas-microsoft-com:vml" xmlns:wp14="http://schemas.microsoft.com/office/word/2010/wordprocessingDrawing" xmlns:wp="http://schemas.openxmlformats.org/drawingml/2006/wordprocessingDrawing" xmlns:w10="urn:schemas-microsoft-com:office:word" xmlns:w="http://schemas.openxmlformats.org/wordprocessingml/2006/main" xmlns:w14="http://schemas.microsoft.com/office/word/2010/wordml" xmlns:w15="http://schemas.microsoft.com/office/word/2012/wordml" xmlns:w16cex="http://schemas.microsoft.com/office/word/2018/wordml/cex" xmlns:w16cid="http://schemas.microsoft.com/office/word/2016/wordml/cid" xmlns:w16="http://schemas.microsoft.com/office/word/2018/wordml" xmlns:w16sdtdh="http://schemas.microsoft.com/office/word/2020/wordml/sdtdatahash" xmlns:w16se="http://schemas.microsoft.com/office/word/2015/wordml/symex" xmlns:wpg="http://schemas.microsoft.com/office/word/2010/wordprocessingGroup" xmlns:wpi="http://schemas.microsoft.com/office/word/2010/wordprocessingInk" xmlns:wne="http://schemas.microsoft.com/office/word/2006/wordml" xmlns:wps="http://schemas.microsoft.com/office/word/2010/wordprocessingShape" mc:Ignorable="w14 w15 w16se w16cid w16 w16cex w16sdtdh wp14">
-  <w:p>
-    <w:pPr>
-      <w:rPr>
-        <w:rFonts w:ascii="Times New Roman" w:hAnsi="Times New Roman"/>
-        <w:sz w:val="28"/>
-        <w:szCs w:val="28"/>
-      </w:rPr>
-    </w:pPr>
-    <w:r>
-      <w:rPr>
-        <w:rFonts w:ascii="Times New Roman" w:hAnsi="Times New Roman"/>
-        <w:sz w:val="28"/>
-        <w:szCs w:val="28"/>
-      </w:rPr>
-      <w:t xml:space="preserve">Пропуск(а) </w:t>
-    </w:r>
-    <w:r>
-      <w:rPr>
-        <w:rFonts w:ascii="Times New Roman" w:hAnsi="Times New Roman"/>
-        <w:bCs/>
-        <w:sz w:val="28"/>
-        <w:szCs w:val="28"/>
-      </w:rPr>
-      <w:t>№</w:t>
-    </w:r>
-    <w:r>
-      <w:rPr>
-        <w:rFonts w:ascii="Times New Roman" w:hAnsi="Times New Roman"/>
-        <w:b/>
-        <w:sz w:val="28"/>
-        <w:szCs w:val="28"/>
-      </w:rPr>
-      <w:t xml:space="preserve"> </w:t>
-    </w:r>
-    <w:r>
-      <w:rPr>
-        <w:rFonts w:ascii="Times New Roman" w:hAnsi="Times New Roman"/>
-        <w:bCs/>
-        <w:sz w:val="28"/>
-        <w:szCs w:val="28"/>
-      </w:rPr>
-      <w:t>__________</w:t>
-    </w:r>
-    <w:r>
-      <w:rPr>
-        <w:rFonts w:ascii="Times New Roman" w:hAnsi="Times New Roman"/>
-        <w:bCs/>
-        <w:sz w:val="28"/>
-        <w:szCs w:val="28"/>
-      </w:rPr>
-      <w:t>________________________</w:t>
-    </w:r>
-    <w:r>
-      <w:rPr>
-        <w:rFonts w:ascii="Times New Roman" w:hAnsi="Times New Roman"/>
-        <w:bCs/>
-        <w:sz w:val="28"/>
-        <w:szCs w:val="28"/>
-      </w:rPr>
-      <w:t>_</w:t>
-    </w:r>
-    <w:r>
-      <w:rPr>
-        <w:rFonts w:ascii="Times New Roman" w:hAnsi="Times New Roman"/>
-        <w:sz w:val="28"/>
-        <w:szCs w:val="28"/>
-      </w:rPr>
-      <w:t>получил</w:t>
-    </w:r>
-    <w:r>
-      <w:rPr>
-        <w:rFonts w:ascii="Times New Roman" w:hAnsi="Times New Roman"/>
-        <w:sz w:val="28"/>
-        <w:szCs w:val="28"/>
-      </w:rPr>
-      <w:t>(а)</w:t>
-    </w:r>
-    <w:r>
-      <w:rPr>
-        <w:rFonts w:ascii="Times New Roman" w:hAnsi="Times New Roman"/>
-        <w:sz w:val="28"/>
-        <w:szCs w:val="28"/>
-      </w:rPr>
-      <w:t xml:space="preserve"> </w:t>
-    </w:r>
-    <w:r>
-      <w:rPr>
-        <w:rFonts w:ascii="Times New Roman" w:hAnsi="Times New Roman"/>
-        <w:sz w:val="28"/>
-        <w:szCs w:val="28"/>
-      </w:rPr>
-      <w:t>___________</w:t>
-    </w:r>
-    <w:r>
-      <w:rPr>
-        <w:rFonts w:ascii="Times New Roman" w:hAnsi="Times New Roman"/>
-        <w:sz w:val="28"/>
-        <w:szCs w:val="28"/>
-      </w:rPr>
-      <w:t xml:space="preserve"> </w:t>
-    </w:r>
-    <w:r>
-      <w:rPr>
-        <w:rFonts w:ascii="Times New Roman" w:hAnsi="Times New Roman"/>
-        <w:sz w:val="28"/>
-        <w:szCs w:val="28"/>
-      </w:rPr>
-      <w:t xml:space="preserve"> </w:t>
-    </w:r>
-  </w:p>
-  <w:p>
-    <w:pPr>
-      <w:rPr>
-        <w:rFonts w:ascii="Times New Roman" w:hAnsi="Times New Roman"/>
-        <w:sz w:val="28"/>
-        <w:szCs w:val="28"/>
-        <w:vertAlign w:val="superscript"/>
-      </w:rPr>
-    </w:pPr>
-    <w:r>
-      <w:rPr>
-        <w:rFonts w:ascii="Times New Roman" w:hAnsi="Times New Roman"/>
-        <w:sz w:val="28"/>
-        <w:szCs w:val="28"/>
-        <w:vertAlign w:val="superscript"/>
-      </w:rPr>
-      <w:t xml:space="preserve">                                                                                                                                                                                             </w:t>
-    </w:r>
-    <w:r>
-      <w:rPr>
-        <w:rFonts w:ascii="Times New Roman" w:hAnsi="Times New Roman"/>
-        <w:sz w:val="28"/>
-        <w:szCs w:val="28"/>
-        <w:vertAlign w:val="superscript"/>
-      </w:rPr>
-      <w:t>(подпись)</w:t>
-    </w:r>
-  </w:p>
-</w:ftr>
 </file>
 
 <file path=word/footnotes.xml><?xml version="1.0" encoding="utf-8"?>

</xml_diff>